<commit_message>
paper: fit v2 tables into a single column
</commit_message>
<xml_diff>
--- a/paper/final/final_draft_v2.docx
+++ b/paper/final/final_draft_v2.docx
@@ -461,17 +461,6 @@
     </w:p>
     <w:p>
       <w:pPr>
-        <w:sectPr>
-          <w:type w:val="continuous"/>
-          <w:pgSz w:w="11906" w:h="16838" w:code="9"/>
-          <w:pgMar w:top="1701" w:right="567" w:bottom="1134" w:left="567" w:header="0" w:footer="0" w:gutter="0"/>
-          <w:cols w:num="2" w:space="720"/>
-          <w:docGrid w:type="lines" w:linePitch="280"/>
-        </w:sectPr>
-      </w:pPr>
-    </w:p>
-    <w:p>
-      <w:pPr>
         <w:keepNext/>
         <w:wordWrap/>
         <w:spacing w:before="80" w:after="40" w:line="240" w:lineRule="auto"/>
@@ -484,7 +473,7 @@
           <w:i w:val="0"/>
           <w:sz w:val="18"/>
         </w:rPr>
-        <w:t>표 1. 그래프 질의 검색 결과 (n=20). hybrid_rr=hybrid_rerank, hybrid_rr_k3=hybrid_rerank_k3. 값은 세 반복의 사례 평균 ± 반복 간 표본 표준편차다.</w:t>
+        <w:t>표 1. 그래프 질의 검색 결과 (n=20, 세 반복 평균±표준편차). H+RR=hybrid_rerank, K3=hybrid_rerank_k3.</w:t>
       </w:r>
     </w:p>
     <w:tbl>
@@ -501,12 +490,16 @@
           <w:insideH w:val="single" w:sz="4" w:space="0" w:color="000000"/>
           <w:insideV w:val="single" w:sz="4" w:space="0" w:color="000000"/>
         </w:tblBorders>
+        <w:tblCellMar>
+          <w:left w:w="57" w:type="dxa"/>
+          <w:right w:w="57" w:type="dxa"/>
+        </w:tblCellMar>
       </w:tblPr>
       <w:tblGrid>
-        <w:gridCol w:w="3061"/>
-        <w:gridCol w:w="2381"/>
-        <w:gridCol w:w="2381"/>
-        <w:gridCol w:w="2381"/>
+        <w:gridCol w:w="1073"/>
+        <w:gridCol w:w="1268"/>
+        <w:gridCol w:w="1268"/>
+        <w:gridCol w:w="1268"/>
       </w:tblGrid>
       <w:tr>
         <w:trPr>
@@ -515,7 +508,7 @@
         </w:trPr>
         <w:tc>
           <w:tcPr>
-            <w:tcW w:type="dxa" w:w="3061"/>
+            <w:tcW w:type="dxa" w:w="1073"/>
             <w:vAlign w:val="center"/>
           </w:tcPr>
           <w:p>
@@ -538,7 +531,7 @@
         </w:tc>
         <w:tc>
           <w:tcPr>
-            <w:tcW w:type="dxa" w:w="2381"/>
+            <w:tcW w:type="dxa" w:w="1268"/>
             <w:vAlign w:val="center"/>
           </w:tcPr>
           <w:p>
@@ -561,7 +554,7 @@
         </w:tc>
         <w:tc>
           <w:tcPr>
-            <w:tcW w:type="dxa" w:w="2381"/>
+            <w:tcW w:type="dxa" w:w="1268"/>
             <w:vAlign w:val="center"/>
           </w:tcPr>
           <w:p>
@@ -578,22 +571,11 @@
                 <w:i w:val="0"/>
                 <w:sz w:val="18"/>
               </w:rPr>
-              <w:t>링크 정답 Recall</w:t>
-            </w:r>
-          </w:p>
-        </w:tc>
-        <w:tc>
-          <w:tcPr>
-            <w:tcW w:type="dxa" w:w="2381"/>
-            <w:vAlign w:val="center"/>
-          </w:tcPr>
-          <w:p>
-            <w:pPr>
-              <w:keepNext/>
-              <w:wordWrap/>
-              <w:spacing w:before="0" w:after="0" w:line="240" w:lineRule="auto"/>
-              <w:jc w:val="center"/>
-            </w:pPr>
+              <w:t>링크 정답</w:t>
+            </w:r>
+            <w:r>
+              <w:br/>
+            </w:r>
             <w:r>
               <w:rPr>
                 <w:rFonts w:ascii="함초롬돋움" w:eastAsia="함초롬돋움" w:hAnsi="함초롬돋움" w:cs="함초롬돋움"/>
@@ -601,7 +583,42 @@
                 <w:i w:val="0"/>
                 <w:sz w:val="18"/>
               </w:rPr>
-              <w:t>근거 수/질의</w:t>
+              <w:t>Recall</w:t>
+            </w:r>
+          </w:p>
+        </w:tc>
+        <w:tc>
+          <w:tcPr>
+            <w:tcW w:type="dxa" w:w="1268"/>
+            <w:vAlign w:val="center"/>
+          </w:tcPr>
+          <w:p>
+            <w:pPr>
+              <w:keepNext/>
+              <w:wordWrap/>
+              <w:spacing w:before="0" w:after="0" w:line="240" w:lineRule="auto"/>
+              <w:jc w:val="center"/>
+            </w:pPr>
+            <w:r>
+              <w:rPr>
+                <w:rFonts w:ascii="함초롬돋움" w:eastAsia="함초롬돋움" w:hAnsi="함초롬돋움" w:cs="함초롬돋움"/>
+                <w:b/>
+                <w:i w:val="0"/>
+                <w:sz w:val="18"/>
+              </w:rPr>
+              <w:t>근거 수</w:t>
+            </w:r>
+            <w:r>
+              <w:br/>
+            </w:r>
+            <w:r>
+              <w:rPr>
+                <w:rFonts w:ascii="함초롬돋움" w:eastAsia="함초롬돋움" w:hAnsi="함초롬돋움" w:cs="함초롬돋움"/>
+                <w:b/>
+                <w:i w:val="0"/>
+                <w:sz w:val="18"/>
+              </w:rPr>
+              <w:t>/질의</w:t>
             </w:r>
           </w:p>
         </w:tc>
@@ -612,7 +629,7 @@
         </w:trPr>
         <w:tc>
           <w:tcPr>
-            <w:tcW w:type="dxa" w:w="3061"/>
+            <w:tcW w:type="dxa" w:w="1073"/>
             <w:vAlign w:val="center"/>
           </w:tcPr>
           <w:p>
@@ -629,76 +646,76 @@
                 <w:i w:val="0"/>
                 <w:sz w:val="18"/>
               </w:rPr>
-              <w:t>bm25</w:t>
-            </w:r>
-          </w:p>
-        </w:tc>
-        <w:tc>
-          <w:tcPr>
-            <w:tcW w:type="dxa" w:w="2381"/>
-            <w:vAlign w:val="center"/>
-          </w:tcPr>
-          <w:p>
-            <w:pPr>
-              <w:keepNext/>
-              <w:wordWrap/>
-              <w:spacing w:before="0" w:after="0" w:line="240" w:lineRule="auto"/>
-              <w:jc w:val="center"/>
-            </w:pPr>
-            <w:r>
-              <w:rPr>
-                <w:rFonts w:ascii="함초롬돋움" w:eastAsia="함초롬돋움" w:hAnsi="함초롬돋움" w:cs="함초롬돋움"/>
-                <w:b w:val="0"/>
-                <w:i w:val="0"/>
-                <w:sz w:val="18"/>
-              </w:rPr>
-              <w:t>0.592 ± 0.000</w:t>
-            </w:r>
-          </w:p>
-        </w:tc>
-        <w:tc>
-          <w:tcPr>
-            <w:tcW w:type="dxa" w:w="2381"/>
-            <w:vAlign w:val="center"/>
-          </w:tcPr>
-          <w:p>
-            <w:pPr>
-              <w:keepNext/>
-              <w:wordWrap/>
-              <w:spacing w:before="0" w:after="0" w:line="240" w:lineRule="auto"/>
-              <w:jc w:val="center"/>
-            </w:pPr>
-            <w:r>
-              <w:rPr>
-                <w:rFonts w:ascii="함초롬돋움" w:eastAsia="함초롬돋움" w:hAnsi="함초롬돋움" w:cs="함초롬돋움"/>
-                <w:b w:val="0"/>
-                <w:i w:val="0"/>
-                <w:sz w:val="18"/>
-              </w:rPr>
-              <w:t>0.275 ± 0.000</w:t>
-            </w:r>
-          </w:p>
-        </w:tc>
-        <w:tc>
-          <w:tcPr>
-            <w:tcW w:type="dxa" w:w="2381"/>
-            <w:vAlign w:val="center"/>
-          </w:tcPr>
-          <w:p>
-            <w:pPr>
-              <w:keepNext/>
-              <w:wordWrap/>
-              <w:spacing w:before="0" w:after="0" w:line="240" w:lineRule="auto"/>
-              <w:jc w:val="center"/>
-            </w:pPr>
-            <w:r>
-              <w:rPr>
-                <w:rFonts w:ascii="함초롬돋움" w:eastAsia="함초롬돋움" w:hAnsi="함초롬돋움" w:cs="함초롬돋움"/>
-                <w:b w:val="0"/>
-                <w:i w:val="0"/>
-                <w:sz w:val="18"/>
-              </w:rPr>
-              <w:t>5.00 ± 0.00</w:t>
+              <w:t>BM25</w:t>
+            </w:r>
+          </w:p>
+        </w:tc>
+        <w:tc>
+          <w:tcPr>
+            <w:tcW w:type="dxa" w:w="1268"/>
+            <w:vAlign w:val="center"/>
+          </w:tcPr>
+          <w:p>
+            <w:pPr>
+              <w:keepNext/>
+              <w:wordWrap/>
+              <w:spacing w:before="0" w:after="0" w:line="240" w:lineRule="auto"/>
+              <w:jc w:val="center"/>
+            </w:pPr>
+            <w:r>
+              <w:rPr>
+                <w:rFonts w:ascii="함초롬돋움" w:eastAsia="함초롬돋움" w:hAnsi="함초롬돋움" w:cs="함초롬돋움"/>
+                <w:b w:val="0"/>
+                <w:i w:val="0"/>
+                <w:sz w:val="18"/>
+              </w:rPr>
+              <w:t>0.592±.000</w:t>
+            </w:r>
+          </w:p>
+        </w:tc>
+        <w:tc>
+          <w:tcPr>
+            <w:tcW w:type="dxa" w:w="1268"/>
+            <w:vAlign w:val="center"/>
+          </w:tcPr>
+          <w:p>
+            <w:pPr>
+              <w:keepNext/>
+              <w:wordWrap/>
+              <w:spacing w:before="0" w:after="0" w:line="240" w:lineRule="auto"/>
+              <w:jc w:val="center"/>
+            </w:pPr>
+            <w:r>
+              <w:rPr>
+                <w:rFonts w:ascii="함초롬돋움" w:eastAsia="함초롬돋움" w:hAnsi="함초롬돋움" w:cs="함초롬돋움"/>
+                <w:b w:val="0"/>
+                <w:i w:val="0"/>
+                <w:sz w:val="18"/>
+              </w:rPr>
+              <w:t>0.275±.000</w:t>
+            </w:r>
+          </w:p>
+        </w:tc>
+        <w:tc>
+          <w:tcPr>
+            <w:tcW w:type="dxa" w:w="1268"/>
+            <w:vAlign w:val="center"/>
+          </w:tcPr>
+          <w:p>
+            <w:pPr>
+              <w:keepNext/>
+              <w:wordWrap/>
+              <w:spacing w:before="0" w:after="0" w:line="240" w:lineRule="auto"/>
+              <w:jc w:val="center"/>
+            </w:pPr>
+            <w:r>
+              <w:rPr>
+                <w:rFonts w:ascii="함초롬돋움" w:eastAsia="함초롬돋움" w:hAnsi="함초롬돋움" w:cs="함초롬돋움"/>
+                <w:b w:val="0"/>
+                <w:i w:val="0"/>
+                <w:sz w:val="18"/>
+              </w:rPr>
+              <w:t>5.00±.00</w:t>
             </w:r>
           </w:p>
         </w:tc>
@@ -709,7 +726,7 @@
         </w:trPr>
         <w:tc>
           <w:tcPr>
-            <w:tcW w:type="dxa" w:w="3061"/>
+            <w:tcW w:type="dxa" w:w="1073"/>
             <w:vAlign w:val="center"/>
           </w:tcPr>
           <w:p>
@@ -726,76 +743,76 @@
                 <w:i w:val="0"/>
                 <w:sz w:val="18"/>
               </w:rPr>
-              <w:t>dense</w:t>
-            </w:r>
-          </w:p>
-        </w:tc>
-        <w:tc>
-          <w:tcPr>
-            <w:tcW w:type="dxa" w:w="2381"/>
-            <w:vAlign w:val="center"/>
-          </w:tcPr>
-          <w:p>
-            <w:pPr>
-              <w:keepNext/>
-              <w:wordWrap/>
-              <w:spacing w:before="0" w:after="0" w:line="240" w:lineRule="auto"/>
-              <w:jc w:val="center"/>
-            </w:pPr>
-            <w:r>
-              <w:rPr>
-                <w:rFonts w:ascii="함초롬돋움" w:eastAsia="함초롬돋움" w:hAnsi="함초롬돋움" w:cs="함초롬돋움"/>
-                <w:b w:val="0"/>
-                <w:i w:val="0"/>
-                <w:sz w:val="18"/>
-              </w:rPr>
-              <w:t>0.383 ± 0.000</w:t>
-            </w:r>
-          </w:p>
-        </w:tc>
-        <w:tc>
-          <w:tcPr>
-            <w:tcW w:type="dxa" w:w="2381"/>
-            <w:vAlign w:val="center"/>
-          </w:tcPr>
-          <w:p>
-            <w:pPr>
-              <w:keepNext/>
-              <w:wordWrap/>
-              <w:spacing w:before="0" w:after="0" w:line="240" w:lineRule="auto"/>
-              <w:jc w:val="center"/>
-            </w:pPr>
-            <w:r>
-              <w:rPr>
-                <w:rFonts w:ascii="함초롬돋움" w:eastAsia="함초롬돋움" w:hAnsi="함초롬돋움" w:cs="함초롬돋움"/>
-                <w:b w:val="0"/>
-                <w:i w:val="0"/>
-                <w:sz w:val="18"/>
-              </w:rPr>
-              <w:t>0.000 ± 0.000</w:t>
-            </w:r>
-          </w:p>
-        </w:tc>
-        <w:tc>
-          <w:tcPr>
-            <w:tcW w:type="dxa" w:w="2381"/>
-            <w:vAlign w:val="center"/>
-          </w:tcPr>
-          <w:p>
-            <w:pPr>
-              <w:keepNext/>
-              <w:wordWrap/>
-              <w:spacing w:before="0" w:after="0" w:line="240" w:lineRule="auto"/>
-              <w:jc w:val="center"/>
-            </w:pPr>
-            <w:r>
-              <w:rPr>
-                <w:rFonts w:ascii="함초롬돋움" w:eastAsia="함초롬돋움" w:hAnsi="함초롬돋움" w:cs="함초롬돋움"/>
-                <w:b w:val="0"/>
-                <w:i w:val="0"/>
-                <w:sz w:val="18"/>
-              </w:rPr>
-              <w:t>5.00 ± 0.00</w:t>
+              <w:t>Dense</w:t>
+            </w:r>
+          </w:p>
+        </w:tc>
+        <w:tc>
+          <w:tcPr>
+            <w:tcW w:type="dxa" w:w="1268"/>
+            <w:vAlign w:val="center"/>
+          </w:tcPr>
+          <w:p>
+            <w:pPr>
+              <w:keepNext/>
+              <w:wordWrap/>
+              <w:spacing w:before="0" w:after="0" w:line="240" w:lineRule="auto"/>
+              <w:jc w:val="center"/>
+            </w:pPr>
+            <w:r>
+              <w:rPr>
+                <w:rFonts w:ascii="함초롬돋움" w:eastAsia="함초롬돋움" w:hAnsi="함초롬돋움" w:cs="함초롬돋움"/>
+                <w:b w:val="0"/>
+                <w:i w:val="0"/>
+                <w:sz w:val="18"/>
+              </w:rPr>
+              <w:t>0.383±.000</w:t>
+            </w:r>
+          </w:p>
+        </w:tc>
+        <w:tc>
+          <w:tcPr>
+            <w:tcW w:type="dxa" w:w="1268"/>
+            <w:vAlign w:val="center"/>
+          </w:tcPr>
+          <w:p>
+            <w:pPr>
+              <w:keepNext/>
+              <w:wordWrap/>
+              <w:spacing w:before="0" w:after="0" w:line="240" w:lineRule="auto"/>
+              <w:jc w:val="center"/>
+            </w:pPr>
+            <w:r>
+              <w:rPr>
+                <w:rFonts w:ascii="함초롬돋움" w:eastAsia="함초롬돋움" w:hAnsi="함초롬돋움" w:cs="함초롬돋움"/>
+                <w:b w:val="0"/>
+                <w:i w:val="0"/>
+                <w:sz w:val="18"/>
+              </w:rPr>
+              <w:t>0.000±.000</w:t>
+            </w:r>
+          </w:p>
+        </w:tc>
+        <w:tc>
+          <w:tcPr>
+            <w:tcW w:type="dxa" w:w="1268"/>
+            <w:vAlign w:val="center"/>
+          </w:tcPr>
+          <w:p>
+            <w:pPr>
+              <w:keepNext/>
+              <w:wordWrap/>
+              <w:spacing w:before="0" w:after="0" w:line="240" w:lineRule="auto"/>
+              <w:jc w:val="center"/>
+            </w:pPr>
+            <w:r>
+              <w:rPr>
+                <w:rFonts w:ascii="함초롬돋움" w:eastAsia="함초롬돋움" w:hAnsi="함초롬돋움" w:cs="함초롬돋움"/>
+                <w:b w:val="0"/>
+                <w:i w:val="0"/>
+                <w:sz w:val="18"/>
+              </w:rPr>
+              <w:t>5.00±.00</w:t>
             </w:r>
           </w:p>
         </w:tc>
@@ -806,7 +823,7 @@
         </w:trPr>
         <w:tc>
           <w:tcPr>
-            <w:tcW w:type="dxa" w:w="3061"/>
+            <w:tcW w:type="dxa" w:w="1073"/>
             <w:vAlign w:val="center"/>
           </w:tcPr>
           <w:p>
@@ -823,76 +840,76 @@
                 <w:i w:val="0"/>
                 <w:sz w:val="18"/>
               </w:rPr>
-              <w:t>hybrid</w:t>
-            </w:r>
-          </w:p>
-        </w:tc>
-        <w:tc>
-          <w:tcPr>
-            <w:tcW w:type="dxa" w:w="2381"/>
-            <w:vAlign w:val="center"/>
-          </w:tcPr>
-          <w:p>
-            <w:pPr>
-              <w:keepNext/>
-              <w:wordWrap/>
-              <w:spacing w:before="0" w:after="0" w:line="240" w:lineRule="auto"/>
-              <w:jc w:val="center"/>
-            </w:pPr>
-            <w:r>
-              <w:rPr>
-                <w:rFonts w:ascii="함초롬돋움" w:eastAsia="함초롬돋움" w:hAnsi="함초롬돋움" w:cs="함초롬돋움"/>
-                <w:b w:val="0"/>
-                <w:i w:val="0"/>
-                <w:sz w:val="18"/>
-              </w:rPr>
-              <w:t>0.521 ± 0.000</w:t>
-            </w:r>
-          </w:p>
-        </w:tc>
-        <w:tc>
-          <w:tcPr>
-            <w:tcW w:type="dxa" w:w="2381"/>
-            <w:vAlign w:val="center"/>
-          </w:tcPr>
-          <w:p>
-            <w:pPr>
-              <w:keepNext/>
-              <w:wordWrap/>
-              <w:spacing w:before="0" w:after="0" w:line="240" w:lineRule="auto"/>
-              <w:jc w:val="center"/>
-            </w:pPr>
-            <w:r>
-              <w:rPr>
-                <w:rFonts w:ascii="함초롬돋움" w:eastAsia="함초롬돋움" w:hAnsi="함초롬돋움" w:cs="함초롬돋움"/>
-                <w:b w:val="0"/>
-                <w:i w:val="0"/>
-                <w:sz w:val="18"/>
-              </w:rPr>
-              <w:t>0.150 ± 0.000</w:t>
-            </w:r>
-          </w:p>
-        </w:tc>
-        <w:tc>
-          <w:tcPr>
-            <w:tcW w:type="dxa" w:w="2381"/>
-            <w:vAlign w:val="center"/>
-          </w:tcPr>
-          <w:p>
-            <w:pPr>
-              <w:keepNext/>
-              <w:wordWrap/>
-              <w:spacing w:before="0" w:after="0" w:line="240" w:lineRule="auto"/>
-              <w:jc w:val="center"/>
-            </w:pPr>
-            <w:r>
-              <w:rPr>
-                <w:rFonts w:ascii="함초롬돋움" w:eastAsia="함초롬돋움" w:hAnsi="함초롬돋움" w:cs="함초롬돋움"/>
-                <w:b w:val="0"/>
-                <w:i w:val="0"/>
-                <w:sz w:val="18"/>
-              </w:rPr>
-              <w:t>5.00 ± 0.00</w:t>
+              <w:t>Hybrid</w:t>
+            </w:r>
+          </w:p>
+        </w:tc>
+        <w:tc>
+          <w:tcPr>
+            <w:tcW w:type="dxa" w:w="1268"/>
+            <w:vAlign w:val="center"/>
+          </w:tcPr>
+          <w:p>
+            <w:pPr>
+              <w:keepNext/>
+              <w:wordWrap/>
+              <w:spacing w:before="0" w:after="0" w:line="240" w:lineRule="auto"/>
+              <w:jc w:val="center"/>
+            </w:pPr>
+            <w:r>
+              <w:rPr>
+                <w:rFonts w:ascii="함초롬돋움" w:eastAsia="함초롬돋움" w:hAnsi="함초롬돋움" w:cs="함초롬돋움"/>
+                <w:b w:val="0"/>
+                <w:i w:val="0"/>
+                <w:sz w:val="18"/>
+              </w:rPr>
+              <w:t>0.521±.000</w:t>
+            </w:r>
+          </w:p>
+        </w:tc>
+        <w:tc>
+          <w:tcPr>
+            <w:tcW w:type="dxa" w:w="1268"/>
+            <w:vAlign w:val="center"/>
+          </w:tcPr>
+          <w:p>
+            <w:pPr>
+              <w:keepNext/>
+              <w:wordWrap/>
+              <w:spacing w:before="0" w:after="0" w:line="240" w:lineRule="auto"/>
+              <w:jc w:val="center"/>
+            </w:pPr>
+            <w:r>
+              <w:rPr>
+                <w:rFonts w:ascii="함초롬돋움" w:eastAsia="함초롬돋움" w:hAnsi="함초롬돋움" w:cs="함초롬돋움"/>
+                <w:b w:val="0"/>
+                <w:i w:val="0"/>
+                <w:sz w:val="18"/>
+              </w:rPr>
+              <w:t>0.150±.000</w:t>
+            </w:r>
+          </w:p>
+        </w:tc>
+        <w:tc>
+          <w:tcPr>
+            <w:tcW w:type="dxa" w:w="1268"/>
+            <w:vAlign w:val="center"/>
+          </w:tcPr>
+          <w:p>
+            <w:pPr>
+              <w:keepNext/>
+              <w:wordWrap/>
+              <w:spacing w:before="0" w:after="0" w:line="240" w:lineRule="auto"/>
+              <w:jc w:val="center"/>
+            </w:pPr>
+            <w:r>
+              <w:rPr>
+                <w:rFonts w:ascii="함초롬돋움" w:eastAsia="함초롬돋움" w:hAnsi="함초롬돋움" w:cs="함초롬돋움"/>
+                <w:b w:val="0"/>
+                <w:i w:val="0"/>
+                <w:sz w:val="18"/>
+              </w:rPr>
+              <w:t>5.00±.00</w:t>
             </w:r>
           </w:p>
         </w:tc>
@@ -903,7 +920,7 @@
         </w:trPr>
         <w:tc>
           <w:tcPr>
-            <w:tcW w:type="dxa" w:w="3061"/>
+            <w:tcW w:type="dxa" w:w="1073"/>
             <w:vAlign w:val="center"/>
           </w:tcPr>
           <w:p>
@@ -920,76 +937,76 @@
                 <w:i w:val="0"/>
                 <w:sz w:val="18"/>
               </w:rPr>
-              <w:t>hybrid_rerank</w:t>
-            </w:r>
-          </w:p>
-        </w:tc>
-        <w:tc>
-          <w:tcPr>
-            <w:tcW w:type="dxa" w:w="2381"/>
-            <w:vAlign w:val="center"/>
-          </w:tcPr>
-          <w:p>
-            <w:pPr>
-              <w:keepNext/>
-              <w:wordWrap/>
-              <w:spacing w:before="0" w:after="0" w:line="240" w:lineRule="auto"/>
-              <w:jc w:val="center"/>
-            </w:pPr>
-            <w:r>
-              <w:rPr>
-                <w:rFonts w:ascii="함초롬돋움" w:eastAsia="함초롬돋움" w:hAnsi="함초롬돋움" w:cs="함초롬돋움"/>
-                <w:b w:val="0"/>
-                <w:i w:val="0"/>
-                <w:sz w:val="18"/>
-              </w:rPr>
-              <w:t>0.586 ± 0.019</w:t>
-            </w:r>
-          </w:p>
-        </w:tc>
-        <w:tc>
-          <w:tcPr>
-            <w:tcW w:type="dxa" w:w="2381"/>
-            <w:vAlign w:val="center"/>
-          </w:tcPr>
-          <w:p>
-            <w:pPr>
-              <w:keepNext/>
-              <w:wordWrap/>
-              <w:spacing w:before="0" w:after="0" w:line="240" w:lineRule="auto"/>
-              <w:jc w:val="center"/>
-            </w:pPr>
-            <w:r>
-              <w:rPr>
-                <w:rFonts w:ascii="함초롬돋움" w:eastAsia="함초롬돋움" w:hAnsi="함초롬돋움" w:cs="함초롬돋움"/>
-                <w:b w:val="0"/>
-                <w:i w:val="0"/>
-                <w:sz w:val="18"/>
-              </w:rPr>
-              <w:t>0.233 ± 0.014</w:t>
-            </w:r>
-          </w:p>
-        </w:tc>
-        <w:tc>
-          <w:tcPr>
-            <w:tcW w:type="dxa" w:w="2381"/>
-            <w:vAlign w:val="center"/>
-          </w:tcPr>
-          <w:p>
-            <w:pPr>
-              <w:keepNext/>
-              <w:wordWrap/>
-              <w:spacing w:before="0" w:after="0" w:line="240" w:lineRule="auto"/>
-              <w:jc w:val="center"/>
-            </w:pPr>
-            <w:r>
-              <w:rPr>
-                <w:rFonts w:ascii="함초롬돋움" w:eastAsia="함초롬돋움" w:hAnsi="함초롬돋움" w:cs="함초롬돋움"/>
-                <w:b w:val="0"/>
-                <w:i w:val="0"/>
-                <w:sz w:val="18"/>
-              </w:rPr>
-              <w:t>2.08 ± 0.06</w:t>
+              <w:t>H+RR</w:t>
+            </w:r>
+          </w:p>
+        </w:tc>
+        <w:tc>
+          <w:tcPr>
+            <w:tcW w:type="dxa" w:w="1268"/>
+            <w:vAlign w:val="center"/>
+          </w:tcPr>
+          <w:p>
+            <w:pPr>
+              <w:keepNext/>
+              <w:wordWrap/>
+              <w:spacing w:before="0" w:after="0" w:line="240" w:lineRule="auto"/>
+              <w:jc w:val="center"/>
+            </w:pPr>
+            <w:r>
+              <w:rPr>
+                <w:rFonts w:ascii="함초롬돋움" w:eastAsia="함초롬돋움" w:hAnsi="함초롬돋움" w:cs="함초롬돋움"/>
+                <w:b w:val="0"/>
+                <w:i w:val="0"/>
+                <w:sz w:val="18"/>
+              </w:rPr>
+              <w:t>0.586±.019</w:t>
+            </w:r>
+          </w:p>
+        </w:tc>
+        <w:tc>
+          <w:tcPr>
+            <w:tcW w:type="dxa" w:w="1268"/>
+            <w:vAlign w:val="center"/>
+          </w:tcPr>
+          <w:p>
+            <w:pPr>
+              <w:keepNext/>
+              <w:wordWrap/>
+              <w:spacing w:before="0" w:after="0" w:line="240" w:lineRule="auto"/>
+              <w:jc w:val="center"/>
+            </w:pPr>
+            <w:r>
+              <w:rPr>
+                <w:rFonts w:ascii="함초롬돋움" w:eastAsia="함초롬돋움" w:hAnsi="함초롬돋움" w:cs="함초롬돋움"/>
+                <w:b w:val="0"/>
+                <w:i w:val="0"/>
+                <w:sz w:val="18"/>
+              </w:rPr>
+              <w:t>0.233±.014</w:t>
+            </w:r>
+          </w:p>
+        </w:tc>
+        <w:tc>
+          <w:tcPr>
+            <w:tcW w:type="dxa" w:w="1268"/>
+            <w:vAlign w:val="center"/>
+          </w:tcPr>
+          <w:p>
+            <w:pPr>
+              <w:keepNext/>
+              <w:wordWrap/>
+              <w:spacing w:before="0" w:after="0" w:line="240" w:lineRule="auto"/>
+              <w:jc w:val="center"/>
+            </w:pPr>
+            <w:r>
+              <w:rPr>
+                <w:rFonts w:ascii="함초롬돋움" w:eastAsia="함초롬돋움" w:hAnsi="함초롬돋움" w:cs="함초롬돋움"/>
+                <w:b w:val="0"/>
+                <w:i w:val="0"/>
+                <w:sz w:val="18"/>
+              </w:rPr>
+              <w:t>2.08±.06</w:t>
             </w:r>
           </w:p>
         </w:tc>
@@ -1000,7 +1017,7 @@
         </w:trPr>
         <w:tc>
           <w:tcPr>
-            <w:tcW w:type="dxa" w:w="3061"/>
+            <w:tcW w:type="dxa" w:w="1073"/>
             <w:vAlign w:val="center"/>
           </w:tcPr>
           <w:p>
@@ -1017,76 +1034,76 @@
                 <w:i w:val="0"/>
                 <w:sz w:val="18"/>
               </w:rPr>
-              <w:t>hybrid_rr_k3</w:t>
-            </w:r>
-          </w:p>
-        </w:tc>
-        <w:tc>
-          <w:tcPr>
-            <w:tcW w:type="dxa" w:w="2381"/>
-            <w:vAlign w:val="center"/>
-          </w:tcPr>
-          <w:p>
-            <w:pPr>
-              <w:keepNext/>
-              <w:wordWrap/>
-              <w:spacing w:before="0" w:after="0" w:line="240" w:lineRule="auto"/>
-              <w:jc w:val="center"/>
-            </w:pPr>
-            <w:r>
-              <w:rPr>
-                <w:rFonts w:ascii="함초롬돋움" w:eastAsia="함초롬돋움" w:hAnsi="함초롬돋움" w:cs="함초롬돋움"/>
-                <w:b w:val="0"/>
-                <w:i w:val="0"/>
-                <w:sz w:val="18"/>
-              </w:rPr>
-              <w:t>0.618 ± 0.017</w:t>
-            </w:r>
-          </w:p>
-        </w:tc>
-        <w:tc>
-          <w:tcPr>
-            <w:tcW w:type="dxa" w:w="2381"/>
-            <w:vAlign w:val="center"/>
-          </w:tcPr>
-          <w:p>
-            <w:pPr>
-              <w:keepNext/>
-              <w:wordWrap/>
-              <w:spacing w:before="0" w:after="0" w:line="240" w:lineRule="auto"/>
-              <w:jc w:val="center"/>
-            </w:pPr>
-            <w:r>
-              <w:rPr>
-                <w:rFonts w:ascii="함초롬돋움" w:eastAsia="함초롬돋움" w:hAnsi="함초롬돋움" w:cs="함초롬돋움"/>
-                <w:b w:val="0"/>
-                <w:i w:val="0"/>
-                <w:sz w:val="18"/>
-              </w:rPr>
-              <w:t>0.225 ± 0.043</w:t>
-            </w:r>
-          </w:p>
-        </w:tc>
-        <w:tc>
-          <w:tcPr>
-            <w:tcW w:type="dxa" w:w="2381"/>
-            <w:vAlign w:val="center"/>
-          </w:tcPr>
-          <w:p>
-            <w:pPr>
-              <w:keepNext/>
-              <w:wordWrap/>
-              <w:spacing w:before="0" w:after="0" w:line="240" w:lineRule="auto"/>
-              <w:jc w:val="center"/>
-            </w:pPr>
-            <w:r>
-              <w:rPr>
-                <w:rFonts w:ascii="함초롬돋움" w:eastAsia="함초롬돋움" w:hAnsi="함초롬돋움" w:cs="함초롬돋움"/>
-                <w:b w:val="0"/>
-                <w:i w:val="0"/>
-                <w:sz w:val="18"/>
-              </w:rPr>
-              <w:t>3.15 ± 0.05</w:t>
+              <w:t>K3</w:t>
+            </w:r>
+          </w:p>
+        </w:tc>
+        <w:tc>
+          <w:tcPr>
+            <w:tcW w:type="dxa" w:w="1268"/>
+            <w:vAlign w:val="center"/>
+          </w:tcPr>
+          <w:p>
+            <w:pPr>
+              <w:keepNext/>
+              <w:wordWrap/>
+              <w:spacing w:before="0" w:after="0" w:line="240" w:lineRule="auto"/>
+              <w:jc w:val="center"/>
+            </w:pPr>
+            <w:r>
+              <w:rPr>
+                <w:rFonts w:ascii="함초롬돋움" w:eastAsia="함초롬돋움" w:hAnsi="함초롬돋움" w:cs="함초롬돋움"/>
+                <w:b w:val="0"/>
+                <w:i w:val="0"/>
+                <w:sz w:val="18"/>
+              </w:rPr>
+              <w:t>0.618±.017</w:t>
+            </w:r>
+          </w:p>
+        </w:tc>
+        <w:tc>
+          <w:tcPr>
+            <w:tcW w:type="dxa" w:w="1268"/>
+            <w:vAlign w:val="center"/>
+          </w:tcPr>
+          <w:p>
+            <w:pPr>
+              <w:keepNext/>
+              <w:wordWrap/>
+              <w:spacing w:before="0" w:after="0" w:line="240" w:lineRule="auto"/>
+              <w:jc w:val="center"/>
+            </w:pPr>
+            <w:r>
+              <w:rPr>
+                <w:rFonts w:ascii="함초롬돋움" w:eastAsia="함초롬돋움" w:hAnsi="함초롬돋움" w:cs="함초롬돋움"/>
+                <w:b w:val="0"/>
+                <w:i w:val="0"/>
+                <w:sz w:val="18"/>
+              </w:rPr>
+              <w:t>0.225±.043</w:t>
+            </w:r>
+          </w:p>
+        </w:tc>
+        <w:tc>
+          <w:tcPr>
+            <w:tcW w:type="dxa" w:w="1268"/>
+            <w:vAlign w:val="center"/>
+          </w:tcPr>
+          <w:p>
+            <w:pPr>
+              <w:keepNext/>
+              <w:wordWrap/>
+              <w:spacing w:before="0" w:after="0" w:line="240" w:lineRule="auto"/>
+              <w:jc w:val="center"/>
+            </w:pPr>
+            <w:r>
+              <w:rPr>
+                <w:rFonts w:ascii="함초롬돋움" w:eastAsia="함초롬돋움" w:hAnsi="함초롬돋움" w:cs="함초롬돋움"/>
+                <w:b w:val="0"/>
+                <w:i w:val="0"/>
+                <w:sz w:val="18"/>
+              </w:rPr>
+              <w:t>3.15±.05</w:t>
             </w:r>
           </w:p>
         </w:tc>
@@ -1097,7 +1114,7 @@
         </w:trPr>
         <w:tc>
           <w:tcPr>
-            <w:tcW w:type="dxa" w:w="3061"/>
+            <w:tcW w:type="dxa" w:w="1073"/>
             <w:vAlign w:val="center"/>
           </w:tcPr>
           <w:p>
@@ -1120,70 +1137,70 @@
         </w:tc>
         <w:tc>
           <w:tcPr>
-            <w:tcW w:type="dxa" w:w="2381"/>
-            <w:vAlign w:val="center"/>
-          </w:tcPr>
-          <w:p>
-            <w:pPr>
-              <w:keepNext/>
-              <w:wordWrap/>
-              <w:spacing w:before="0" w:after="0" w:line="240" w:lineRule="auto"/>
-              <w:jc w:val="center"/>
-            </w:pPr>
-            <w:r>
-              <w:rPr>
-                <w:rFonts w:ascii="함초롬돋움" w:eastAsia="함초롬돋움" w:hAnsi="함초롬돋움" w:cs="함초롬돋움"/>
-                <w:b w:val="0"/>
-                <w:i w:val="0"/>
-                <w:sz w:val="18"/>
-              </w:rPr>
-              <w:t>0.850 ± 0.014</w:t>
-            </w:r>
-          </w:p>
-        </w:tc>
-        <w:tc>
-          <w:tcPr>
-            <w:tcW w:type="dxa" w:w="2381"/>
-            <w:vAlign w:val="center"/>
-          </w:tcPr>
-          <w:p>
-            <w:pPr>
-              <w:keepNext/>
-              <w:wordWrap/>
-              <w:spacing w:before="0" w:after="0" w:line="240" w:lineRule="auto"/>
-              <w:jc w:val="center"/>
-            </w:pPr>
-            <w:r>
-              <w:rPr>
-                <w:rFonts w:ascii="함초롬돋움" w:eastAsia="함초롬돋움" w:hAnsi="함초롬돋움" w:cs="함초롬돋움"/>
-                <w:b w:val="0"/>
-                <w:i w:val="0"/>
-                <w:sz w:val="18"/>
-              </w:rPr>
-              <w:t>0.750 ± 0.000</w:t>
-            </w:r>
-          </w:p>
-        </w:tc>
-        <w:tc>
-          <w:tcPr>
-            <w:tcW w:type="dxa" w:w="2381"/>
-            <w:vAlign w:val="center"/>
-          </w:tcPr>
-          <w:p>
-            <w:pPr>
-              <w:keepNext/>
-              <w:wordWrap/>
-              <w:spacing w:before="0" w:after="0" w:line="240" w:lineRule="auto"/>
-              <w:jc w:val="center"/>
-            </w:pPr>
-            <w:r>
-              <w:rPr>
-                <w:rFonts w:ascii="함초롬돋움" w:eastAsia="함초롬돋움" w:hAnsi="함초롬돋움" w:cs="함초롬돋움"/>
-                <w:b w:val="0"/>
-                <w:i w:val="0"/>
-                <w:sz w:val="18"/>
-              </w:rPr>
-              <w:t>3.08 ± 0.03</w:t>
+            <w:tcW w:type="dxa" w:w="1268"/>
+            <w:vAlign w:val="center"/>
+          </w:tcPr>
+          <w:p>
+            <w:pPr>
+              <w:keepNext/>
+              <w:wordWrap/>
+              <w:spacing w:before="0" w:after="0" w:line="240" w:lineRule="auto"/>
+              <w:jc w:val="center"/>
+            </w:pPr>
+            <w:r>
+              <w:rPr>
+                <w:rFonts w:ascii="함초롬돋움" w:eastAsia="함초롬돋움" w:hAnsi="함초롬돋움" w:cs="함초롬돋움"/>
+                <w:b w:val="0"/>
+                <w:i w:val="0"/>
+                <w:sz w:val="18"/>
+              </w:rPr>
+              <w:t>0.850±.014</w:t>
+            </w:r>
+          </w:p>
+        </w:tc>
+        <w:tc>
+          <w:tcPr>
+            <w:tcW w:type="dxa" w:w="1268"/>
+            <w:vAlign w:val="center"/>
+          </w:tcPr>
+          <w:p>
+            <w:pPr>
+              <w:keepNext/>
+              <w:wordWrap/>
+              <w:spacing w:before="0" w:after="0" w:line="240" w:lineRule="auto"/>
+              <w:jc w:val="center"/>
+            </w:pPr>
+            <w:r>
+              <w:rPr>
+                <w:rFonts w:ascii="함초롬돋움" w:eastAsia="함초롬돋움" w:hAnsi="함초롬돋움" w:cs="함초롬돋움"/>
+                <w:b w:val="0"/>
+                <w:i w:val="0"/>
+                <w:sz w:val="18"/>
+              </w:rPr>
+              <w:t>0.750±.000</w:t>
+            </w:r>
+          </w:p>
+        </w:tc>
+        <w:tc>
+          <w:tcPr>
+            <w:tcW w:type="dxa" w:w="1268"/>
+            <w:vAlign w:val="center"/>
+          </w:tcPr>
+          <w:p>
+            <w:pPr>
+              <w:keepNext/>
+              <w:wordWrap/>
+              <w:spacing w:before="0" w:after="0" w:line="240" w:lineRule="auto"/>
+              <w:jc w:val="center"/>
+            </w:pPr>
+            <w:r>
+              <w:rPr>
+                <w:rFonts w:ascii="함초롬돋움" w:eastAsia="함초롬돋움" w:hAnsi="함초롬돋움" w:cs="함초롬돋움"/>
+                <w:b w:val="0"/>
+                <w:i w:val="0"/>
+                <w:sz w:val="18"/>
+              </w:rPr>
+              <w:t>3.08±.03</w:t>
             </w:r>
           </w:p>
         </w:tc>
@@ -1194,7 +1211,7 @@
         </w:trPr>
         <w:tc>
           <w:tcPr>
-            <w:tcW w:type="dxa" w:w="3061"/>
+            <w:tcW w:type="dxa" w:w="1073"/>
             <w:vAlign w:val="center"/>
           </w:tcPr>
           <w:p>
@@ -1217,7 +1234,7 @@
         </w:tc>
         <w:tc>
           <w:tcPr>
-            <w:tcW w:type="dxa" w:w="2381"/>
+            <w:tcW w:type="dxa" w:w="1268"/>
             <w:vAlign w:val="center"/>
           </w:tcPr>
           <w:p>
@@ -1234,13 +1251,13 @@
                 <w:i w:val="0"/>
                 <w:sz w:val="18"/>
               </w:rPr>
-              <w:t>0.839 ± 0.046</w:t>
-            </w:r>
-          </w:p>
-        </w:tc>
-        <w:tc>
-          <w:tcPr>
-            <w:tcW w:type="dxa" w:w="2381"/>
+              <w:t>0.839±.046</w:t>
+            </w:r>
+          </w:p>
+        </w:tc>
+        <w:tc>
+          <w:tcPr>
+            <w:tcW w:type="dxa" w:w="1268"/>
             <w:vAlign w:val="center"/>
           </w:tcPr>
           <w:p>
@@ -1257,13 +1274,13 @@
                 <w:i w:val="0"/>
                 <w:sz w:val="18"/>
               </w:rPr>
-              <w:t>0.708 ± 0.063</w:t>
-            </w:r>
-          </w:p>
-        </w:tc>
-        <w:tc>
-          <w:tcPr>
-            <w:tcW w:type="dxa" w:w="2381"/>
+              <w:t>0.708±.063</w:t>
+            </w:r>
+          </w:p>
+        </w:tc>
+        <w:tc>
+          <w:tcPr>
+            <w:tcW w:type="dxa" w:w="1268"/>
             <w:vAlign w:val="center"/>
           </w:tcPr>
           <w:p>
@@ -1280,7 +1297,7 @@
                 <w:i w:val="0"/>
                 <w:sz w:val="18"/>
               </w:rPr>
-              <w:t>3.00 ± 0.17</w:t>
+              <w:t>3.00±.17</w:t>
             </w:r>
           </w:p>
         </w:tc>
@@ -1288,30 +1305,8 @@
     </w:tbl>
     <w:p>
       <w:pPr>
-        <w:sectPr>
-          <w:type w:val="continuous"/>
-          <w:pgSz w:w="11906" w:h="16838" w:code="9"/>
-          <w:pgMar w:top="1701" w:right="567" w:bottom="1134" w:left="567" w:header="0" w:footer="0" w:gutter="0"/>
-          <w:cols w:num="1" w:space="720"/>
-          <w:docGrid w:type="lines" w:linePitch="280"/>
-        </w:sectPr>
-      </w:pPr>
-    </w:p>
-    <w:p>
-      <w:pPr>
         <w:wordWrap/>
         <w:spacing w:before="0" w:after="0" w:line="120" w:lineRule="exact"/>
-      </w:pPr>
-    </w:p>
-    <w:p>
-      <w:pPr>
-        <w:sectPr>
-          <w:type w:val="continuous"/>
-          <w:pgSz w:w="11906" w:h="16838" w:code="9"/>
-          <w:pgMar w:top="1701" w:right="567" w:bottom="1134" w:left="567" w:header="0" w:footer="0" w:gutter="0"/>
-          <w:cols w:num="2" w:space="720"/>
-          <w:docGrid w:type="lines" w:linePitch="280"/>
-        </w:sectPr>
       </w:pPr>
     </w:p>
     <w:p>
@@ -1328,7 +1323,7 @@
           <w:i w:val="0"/>
           <w:sz w:val="18"/>
         </w:rPr>
-        <w:t>표 2. 출처별 paired 차이와 연결 정답 끝점 군집 bootstrap (10,000회). k3=hybrid_rerank_k3; 차이는 첫 변형 − 둘째 변형이며 CI는 기술적 민감도 구간이다.</w:t>
+        <w:t>표 2. 출처별 paired 차이와 끝점 군집 bootstrap 95% CI (10,000회). L=link_all, P=proposed, K3=hybrid_rerank_k3.</w:t>
       </w:r>
     </w:p>
     <w:tbl>
@@ -1345,12 +1340,15 @@
           <w:insideH w:val="single" w:sz="4" w:space="0" w:color="000000"/>
           <w:insideV w:val="single" w:sz="4" w:space="0" w:color="000000"/>
         </w:tblBorders>
+        <w:tblCellMar>
+          <w:left w:w="57" w:type="dxa"/>
+          <w:right w:w="57" w:type="dxa"/>
+        </w:tblCellMar>
       </w:tblPr>
       <w:tblGrid>
-        <w:gridCol w:w="3061"/>
-        <w:gridCol w:w="2381"/>
-        <w:gridCol w:w="2381"/>
-        <w:gridCol w:w="2381"/>
+        <w:gridCol w:w="1365"/>
+        <w:gridCol w:w="1755"/>
+        <w:gridCol w:w="1755"/>
       </w:tblGrid>
       <w:tr>
         <w:trPr>
@@ -1359,7 +1357,7 @@
         </w:trPr>
         <w:tc>
           <w:tcPr>
-            <w:tcW w:type="dxa" w:w="3061"/>
+            <w:tcW w:type="dxa" w:w="1365"/>
             <w:vAlign w:val="center"/>
           </w:tcPr>
           <w:p>
@@ -1376,13 +1374,13 @@
                 <w:i w:val="0"/>
                 <w:sz w:val="18"/>
               </w:rPr>
-              <w:t>출처 (사례/군집)</w:t>
-            </w:r>
-          </w:p>
-        </w:tc>
-        <w:tc>
-          <w:tcPr>
-            <w:tcW w:type="dxa" w:w="2381"/>
+              <w:t>비교</w:t>
+            </w:r>
+          </w:p>
+        </w:tc>
+        <w:tc>
+          <w:tcPr>
+            <w:tcW w:type="dxa" w:w="1755"/>
             <w:vAlign w:val="center"/>
           </w:tcPr>
           <w:p>
@@ -1399,13 +1397,13 @@
                 <w:i w:val="0"/>
                 <w:sz w:val="18"/>
               </w:rPr>
-              <w:t>비교</w:t>
-            </w:r>
-          </w:p>
-        </w:tc>
-        <w:tc>
-          <w:tcPr>
-            <w:tcW w:type="dxa" w:w="2381"/>
+              <w:t>ΔRecall</w:t>
+            </w:r>
+          </w:p>
+        </w:tc>
+        <w:tc>
+          <w:tcPr>
+            <w:tcW w:type="dxa" w:w="1755"/>
             <w:vAlign w:val="center"/>
           </w:tcPr>
           <w:p>
@@ -1422,30 +1420,7 @@
                 <w:i w:val="0"/>
                 <w:sz w:val="18"/>
               </w:rPr>
-              <w:t>ΔRecall [95% CI]</w:t>
-            </w:r>
-          </w:p>
-        </w:tc>
-        <w:tc>
-          <w:tcPr>
-            <w:tcW w:type="dxa" w:w="2381"/>
-            <w:vAlign w:val="center"/>
-          </w:tcPr>
-          <w:p>
-            <w:pPr>
-              <w:keepNext/>
-              <w:wordWrap/>
-              <w:spacing w:before="0" w:after="0" w:line="240" w:lineRule="auto"/>
-              <w:jc w:val="center"/>
-            </w:pPr>
-            <w:r>
-              <w:rPr>
-                <w:rFonts w:ascii="함초롬돋움" w:eastAsia="함초롬돋움" w:hAnsi="함초롬돋움" w:cs="함초롬돋움"/>
-                <w:b/>
-                <w:i w:val="0"/>
-                <w:sz w:val="18"/>
-              </w:rPr>
-              <w:t>Δ링크 정답 Recall [95% CI]</w:t>
+              <w:t>Δ링크 정답 Recall</w:t>
             </w:r>
           </w:p>
         </w:tc>
@@ -1456,93 +1431,23 @@
         </w:trPr>
         <w:tc>
           <w:tcPr>
-            <w:tcW w:type="dxa" w:w="3061"/>
-            <w:vAlign w:val="center"/>
-          </w:tcPr>
-          <w:p>
-            <w:pPr>
-              <w:keepNext/>
-              <w:wordWrap/>
-              <w:spacing w:before="0" w:after="0" w:line="240" w:lineRule="auto"/>
-              <w:jc w:val="left"/>
-            </w:pPr>
-            <w:r>
-              <w:rPr>
-                <w:rFonts w:ascii="함초롬돋움" w:eastAsia="함초롬돋움" w:hAnsi="함초롬돋움" w:cs="함초롬돋움"/>
-                <w:b w:val="0"/>
-                <w:i w:val="0"/>
-                <w:sz w:val="18"/>
-              </w:rPr>
-              <w:t>existing_v2 (5/5)</w:t>
-            </w:r>
-          </w:p>
-        </w:tc>
-        <w:tc>
-          <w:tcPr>
-            <w:tcW w:type="dxa" w:w="2381"/>
-            <w:vAlign w:val="center"/>
-          </w:tcPr>
-          <w:p>
-            <w:pPr>
-              <w:keepNext/>
-              <w:wordWrap/>
-              <w:spacing w:before="0" w:after="0" w:line="240" w:lineRule="auto"/>
-              <w:jc w:val="center"/>
-            </w:pPr>
-            <w:r>
-              <w:rPr>
-                <w:rFonts w:ascii="함초롬돋움" w:eastAsia="함초롬돋움" w:hAnsi="함초롬돋움" w:cs="함초롬돋움"/>
-                <w:b w:val="0"/>
-                <w:i w:val="0"/>
-                <w:sz w:val="18"/>
-              </w:rPr>
-              <w:t>link_all − k3</w:t>
-            </w:r>
-          </w:p>
-        </w:tc>
-        <w:tc>
-          <w:tcPr>
-            <w:tcW w:type="dxa" w:w="2381"/>
-            <w:vAlign w:val="center"/>
-          </w:tcPr>
-          <w:p>
-            <w:pPr>
-              <w:keepNext/>
-              <w:wordWrap/>
-              <w:spacing w:before="0" w:after="0" w:line="240" w:lineRule="auto"/>
-              <w:jc w:val="center"/>
-            </w:pPr>
-            <w:r>
-              <w:rPr>
-                <w:rFonts w:ascii="함초롬돋움" w:eastAsia="함초롬돋움" w:hAnsi="함초롬돋움" w:cs="함초롬돋움"/>
-                <w:b w:val="0"/>
-                <w:i w:val="0"/>
-                <w:sz w:val="18"/>
-              </w:rPr>
-              <w:t>+0.128 [+0.017, +0.244]</w:t>
-            </w:r>
-          </w:p>
-        </w:tc>
-        <w:tc>
-          <w:tcPr>
-            <w:tcW w:type="dxa" w:w="2381"/>
-            <w:vAlign w:val="center"/>
-          </w:tcPr>
-          <w:p>
-            <w:pPr>
-              <w:keepNext/>
-              <w:wordWrap/>
-              <w:spacing w:before="0" w:after="0" w:line="240" w:lineRule="auto"/>
-              <w:jc w:val="center"/>
-            </w:pPr>
-            <w:r>
-              <w:rPr>
-                <w:rFonts w:ascii="함초롬돋움" w:eastAsia="함초롬돋움" w:hAnsi="함초롬돋움" w:cs="함초롬돋움"/>
-                <w:b w:val="0"/>
-                <w:i w:val="0"/>
-                <w:sz w:val="18"/>
-              </w:rPr>
-              <w:t>+0.367 [+0.067, +0.700]</w:t>
+            <w:tcW w:type="dxa" w:w="10773"/>
+            <w:gridSpan w:val="3"/>
+          </w:tcPr>
+          <w:p>
+            <w:pPr>
+              <w:keepNext/>
+              <w:wordWrap/>
+              <w:spacing w:before="0" w:after="0" w:line="240" w:lineRule="auto"/>
+            </w:pPr>
+            <w:r>
+              <w:rPr>
+                <w:rFonts w:ascii="함초롬돋움" w:eastAsia="함초롬돋움" w:hAnsi="함초롬돋움" w:cs="함초롬돋움"/>
+                <w:b/>
+                <w:i w:val="0"/>
+                <w:sz w:val="18"/>
+              </w:rPr>
+              <w:t>existing_v2 (사례 5/군집 5)</w:t>
             </w:r>
           </w:p>
         </w:tc>
@@ -1553,7 +1458,7 @@
         </w:trPr>
         <w:tc>
           <w:tcPr>
-            <w:tcW w:type="dxa" w:w="3061"/>
+            <w:tcW w:type="dxa" w:w="1365"/>
             <w:vAlign w:val="center"/>
           </w:tcPr>
           <w:p>
@@ -1570,76 +1475,77 @@
                 <w:i w:val="0"/>
                 <w:sz w:val="18"/>
               </w:rPr>
-              <w:t>existing_v2 (5/5)</w:t>
-            </w:r>
-          </w:p>
-        </w:tc>
-        <w:tc>
-          <w:tcPr>
-            <w:tcW w:type="dxa" w:w="2381"/>
-            <w:vAlign w:val="center"/>
-          </w:tcPr>
-          <w:p>
-            <w:pPr>
-              <w:keepNext/>
-              <w:wordWrap/>
-              <w:spacing w:before="0" w:after="0" w:line="240" w:lineRule="auto"/>
-              <w:jc w:val="center"/>
-            </w:pPr>
-            <w:r>
-              <w:rPr>
-                <w:rFonts w:ascii="함초롬돋움" w:eastAsia="함초롬돋움" w:hAnsi="함초롬돋움" w:cs="함초롬돋움"/>
-                <w:b w:val="0"/>
-                <w:i w:val="0"/>
-                <w:sz w:val="18"/>
-              </w:rPr>
-              <w:t>proposed − k3</w:t>
-            </w:r>
-          </w:p>
-        </w:tc>
-        <w:tc>
-          <w:tcPr>
-            <w:tcW w:type="dxa" w:w="2381"/>
-            <w:vAlign w:val="center"/>
-          </w:tcPr>
-          <w:p>
-            <w:pPr>
-              <w:keepNext/>
-              <w:wordWrap/>
-              <w:spacing w:before="0" w:after="0" w:line="240" w:lineRule="auto"/>
-              <w:jc w:val="center"/>
-            </w:pPr>
-            <w:r>
-              <w:rPr>
-                <w:rFonts w:ascii="함초롬돋움" w:eastAsia="함초롬돋움" w:hAnsi="함초롬돋움" w:cs="함초롬돋움"/>
-                <w:b w:val="0"/>
-                <w:i w:val="0"/>
-                <w:sz w:val="18"/>
-              </w:rPr>
-              <w:t>+0.150 [+0.017, +0.283]</w:t>
-            </w:r>
-          </w:p>
-        </w:tc>
-        <w:tc>
-          <w:tcPr>
-            <w:tcW w:type="dxa" w:w="2381"/>
-            <w:vAlign w:val="center"/>
-          </w:tcPr>
-          <w:p>
-            <w:pPr>
-              <w:keepNext/>
-              <w:wordWrap/>
-              <w:spacing w:before="0" w:after="0" w:line="240" w:lineRule="auto"/>
-              <w:jc w:val="center"/>
-            </w:pPr>
-            <w:r>
-              <w:rPr>
-                <w:rFonts w:ascii="함초롬돋움" w:eastAsia="함초롬돋움" w:hAnsi="함초롬돋움" w:cs="함초롬돋움"/>
-                <w:b w:val="0"/>
-                <w:i w:val="0"/>
-                <w:sz w:val="18"/>
-              </w:rPr>
-              <w:t>+0.400 [+0.100, +0.700]</w:t>
+              <w:t>L − K3</w:t>
+            </w:r>
+          </w:p>
+        </w:tc>
+        <w:tc>
+          <w:tcPr>
+            <w:tcW w:type="dxa" w:w="1755"/>
+            <w:vAlign w:val="center"/>
+          </w:tcPr>
+          <w:p>
+            <w:pPr>
+              <w:keepNext/>
+              <w:wordWrap/>
+              <w:spacing w:before="0" w:after="0" w:line="240" w:lineRule="auto"/>
+              <w:jc w:val="center"/>
+            </w:pPr>
+            <w:r>
+              <w:rPr>
+                <w:rFonts w:ascii="함초롬돋움" w:eastAsia="함초롬돋움" w:hAnsi="함초롬돋움" w:cs="함초롬돋움"/>
+                <w:b w:val="0"/>
+                <w:i w:val="0"/>
+                <w:sz w:val="18"/>
+              </w:rPr>
+              <w:t>+0.128</w:t>
+            </w:r>
+            <w:r>
+              <w:br/>
+            </w:r>
+            <w:r>
+              <w:rPr>
+                <w:rFonts w:ascii="함초롬돋움" w:eastAsia="함초롬돋움" w:hAnsi="함초롬돋움" w:cs="함초롬돋움"/>
+                <w:b w:val="0"/>
+                <w:i w:val="0"/>
+                <w:sz w:val="18"/>
+              </w:rPr>
+              <w:t>[+0.017, +0.244]</w:t>
+            </w:r>
+          </w:p>
+        </w:tc>
+        <w:tc>
+          <w:tcPr>
+            <w:tcW w:type="dxa" w:w="1755"/>
+            <w:vAlign w:val="center"/>
+          </w:tcPr>
+          <w:p>
+            <w:pPr>
+              <w:keepNext/>
+              <w:wordWrap/>
+              <w:spacing w:before="0" w:after="0" w:line="240" w:lineRule="auto"/>
+              <w:jc w:val="center"/>
+            </w:pPr>
+            <w:r>
+              <w:rPr>
+                <w:rFonts w:ascii="함초롬돋움" w:eastAsia="함초롬돋움" w:hAnsi="함초롬돋움" w:cs="함초롬돋움"/>
+                <w:b w:val="0"/>
+                <w:i w:val="0"/>
+                <w:sz w:val="18"/>
+              </w:rPr>
+              <w:t>+0.367</w:t>
+            </w:r>
+            <w:r>
+              <w:br/>
+            </w:r>
+            <w:r>
+              <w:rPr>
+                <w:rFonts w:ascii="함초롬돋움" w:eastAsia="함초롬돋움" w:hAnsi="함초롬돋움" w:cs="함초롬돋움"/>
+                <w:b w:val="0"/>
+                <w:i w:val="0"/>
+                <w:sz w:val="18"/>
+              </w:rPr>
+              <w:t>[+0.067, +0.700]</w:t>
             </w:r>
           </w:p>
         </w:tc>
@@ -1650,7 +1556,7 @@
         </w:trPr>
         <w:tc>
           <w:tcPr>
-            <w:tcW w:type="dxa" w:w="3061"/>
+            <w:tcW w:type="dxa" w:w="1365"/>
             <w:vAlign w:val="center"/>
           </w:tcPr>
           <w:p>
@@ -1667,76 +1573,77 @@
                 <w:i w:val="0"/>
                 <w:sz w:val="18"/>
               </w:rPr>
-              <w:t>existing_v2 (5/5)</w:t>
-            </w:r>
-          </w:p>
-        </w:tc>
-        <w:tc>
-          <w:tcPr>
-            <w:tcW w:type="dxa" w:w="2381"/>
-            <w:vAlign w:val="center"/>
-          </w:tcPr>
-          <w:p>
-            <w:pPr>
-              <w:keepNext/>
-              <w:wordWrap/>
-              <w:spacing w:before="0" w:after="0" w:line="240" w:lineRule="auto"/>
-              <w:jc w:val="center"/>
-            </w:pPr>
-            <w:r>
-              <w:rPr>
-                <w:rFonts w:ascii="함초롬돋움" w:eastAsia="함초롬돋움" w:hAnsi="함초롬돋움" w:cs="함초롬돋움"/>
-                <w:b w:val="0"/>
-                <w:i w:val="0"/>
-                <w:sz w:val="18"/>
-              </w:rPr>
-              <w:t>proposed − link_all</w:t>
-            </w:r>
-          </w:p>
-        </w:tc>
-        <w:tc>
-          <w:tcPr>
-            <w:tcW w:type="dxa" w:w="2381"/>
-            <w:vAlign w:val="center"/>
-          </w:tcPr>
-          <w:p>
-            <w:pPr>
-              <w:keepNext/>
-              <w:wordWrap/>
-              <w:spacing w:before="0" w:after="0" w:line="240" w:lineRule="auto"/>
-              <w:jc w:val="center"/>
-            </w:pPr>
-            <w:r>
-              <w:rPr>
-                <w:rFonts w:ascii="함초롬돋움" w:eastAsia="함초롬돋움" w:hAnsi="함초롬돋움" w:cs="함초롬돋움"/>
-                <w:b w:val="0"/>
-                <w:i w:val="0"/>
-                <w:sz w:val="18"/>
-              </w:rPr>
-              <w:t>+0.022 [+0.000, +0.067]</w:t>
-            </w:r>
-          </w:p>
-        </w:tc>
-        <w:tc>
-          <w:tcPr>
-            <w:tcW w:type="dxa" w:w="2381"/>
-            <w:vAlign w:val="center"/>
-          </w:tcPr>
-          <w:p>
-            <w:pPr>
-              <w:keepNext/>
-              <w:wordWrap/>
-              <w:spacing w:before="0" w:after="0" w:line="240" w:lineRule="auto"/>
-              <w:jc w:val="center"/>
-            </w:pPr>
-            <w:r>
-              <w:rPr>
-                <w:rFonts w:ascii="함초롬돋움" w:eastAsia="함초롬돋움" w:hAnsi="함초롬돋움" w:cs="함초롬돋움"/>
-                <w:b w:val="0"/>
-                <w:i w:val="0"/>
-                <w:sz w:val="18"/>
-              </w:rPr>
-              <w:t>+0.033 [+0.000, +0.100]</w:t>
+              <w:t>P − K3</w:t>
+            </w:r>
+          </w:p>
+        </w:tc>
+        <w:tc>
+          <w:tcPr>
+            <w:tcW w:type="dxa" w:w="1755"/>
+            <w:vAlign w:val="center"/>
+          </w:tcPr>
+          <w:p>
+            <w:pPr>
+              <w:keepNext/>
+              <w:wordWrap/>
+              <w:spacing w:before="0" w:after="0" w:line="240" w:lineRule="auto"/>
+              <w:jc w:val="center"/>
+            </w:pPr>
+            <w:r>
+              <w:rPr>
+                <w:rFonts w:ascii="함초롬돋움" w:eastAsia="함초롬돋움" w:hAnsi="함초롬돋움" w:cs="함초롬돋움"/>
+                <w:b w:val="0"/>
+                <w:i w:val="0"/>
+                <w:sz w:val="18"/>
+              </w:rPr>
+              <w:t>+0.150</w:t>
+            </w:r>
+            <w:r>
+              <w:br/>
+            </w:r>
+            <w:r>
+              <w:rPr>
+                <w:rFonts w:ascii="함초롬돋움" w:eastAsia="함초롬돋움" w:hAnsi="함초롬돋움" w:cs="함초롬돋움"/>
+                <w:b w:val="0"/>
+                <w:i w:val="0"/>
+                <w:sz w:val="18"/>
+              </w:rPr>
+              <w:t>[+0.017, +0.283]</w:t>
+            </w:r>
+          </w:p>
+        </w:tc>
+        <w:tc>
+          <w:tcPr>
+            <w:tcW w:type="dxa" w:w="1755"/>
+            <w:vAlign w:val="center"/>
+          </w:tcPr>
+          <w:p>
+            <w:pPr>
+              <w:keepNext/>
+              <w:wordWrap/>
+              <w:spacing w:before="0" w:after="0" w:line="240" w:lineRule="auto"/>
+              <w:jc w:val="center"/>
+            </w:pPr>
+            <w:r>
+              <w:rPr>
+                <w:rFonts w:ascii="함초롬돋움" w:eastAsia="함초롬돋움" w:hAnsi="함초롬돋움" w:cs="함초롬돋움"/>
+                <w:b w:val="0"/>
+                <w:i w:val="0"/>
+                <w:sz w:val="18"/>
+              </w:rPr>
+              <w:t>+0.400</w:t>
+            </w:r>
+            <w:r>
+              <w:br/>
+            </w:r>
+            <w:r>
+              <w:rPr>
+                <w:rFonts w:ascii="함초롬돋움" w:eastAsia="함초롬돋움" w:hAnsi="함초롬돋움" w:cs="함초롬돋움"/>
+                <w:b w:val="0"/>
+                <w:i w:val="0"/>
+                <w:sz w:val="18"/>
+              </w:rPr>
+              <w:t>[+0.100, +0.700]</w:t>
             </w:r>
           </w:p>
         </w:tc>
@@ -1747,7 +1654,7 @@
         </w:trPr>
         <w:tc>
           <w:tcPr>
-            <w:tcW w:type="dxa" w:w="3061"/>
+            <w:tcW w:type="dxa" w:w="1365"/>
             <w:vAlign w:val="center"/>
           </w:tcPr>
           <w:p>
@@ -1764,76 +1671,77 @@
                 <w:i w:val="0"/>
                 <w:sz w:val="18"/>
               </w:rPr>
-              <w:t>llm_drafted (15/6)</w:t>
-            </w:r>
-          </w:p>
-        </w:tc>
-        <w:tc>
-          <w:tcPr>
-            <w:tcW w:type="dxa" w:w="2381"/>
-            <w:vAlign w:val="center"/>
-          </w:tcPr>
-          <w:p>
-            <w:pPr>
-              <w:keepNext/>
-              <w:wordWrap/>
-              <w:spacing w:before="0" w:after="0" w:line="240" w:lineRule="auto"/>
-              <w:jc w:val="center"/>
-            </w:pPr>
-            <w:r>
-              <w:rPr>
-                <w:rFonts w:ascii="함초롬돋움" w:eastAsia="함초롬돋움" w:hAnsi="함초롬돋움" w:cs="함초롬돋움"/>
-                <w:b w:val="0"/>
-                <w:i w:val="0"/>
-                <w:sz w:val="18"/>
-              </w:rPr>
-              <w:t>link_all − k3</w:t>
-            </w:r>
-          </w:p>
-        </w:tc>
-        <w:tc>
-          <w:tcPr>
-            <w:tcW w:type="dxa" w:w="2381"/>
-            <w:vAlign w:val="center"/>
-          </w:tcPr>
-          <w:p>
-            <w:pPr>
-              <w:keepNext/>
-              <w:wordWrap/>
-              <w:spacing w:before="0" w:after="0" w:line="240" w:lineRule="auto"/>
-              <w:jc w:val="center"/>
-            </w:pPr>
-            <w:r>
-              <w:rPr>
-                <w:rFonts w:ascii="함초롬돋움" w:eastAsia="함초롬돋움" w:hAnsi="함초롬돋움" w:cs="함초롬돋움"/>
-                <w:b w:val="0"/>
-                <w:i w:val="0"/>
-                <w:sz w:val="18"/>
-              </w:rPr>
-              <w:t>+0.267 [+0.083, +0.440]</w:t>
-            </w:r>
-          </w:p>
-        </w:tc>
-        <w:tc>
-          <w:tcPr>
-            <w:tcW w:type="dxa" w:w="2381"/>
-            <w:vAlign w:val="center"/>
-          </w:tcPr>
-          <w:p>
-            <w:pPr>
-              <w:keepNext/>
-              <w:wordWrap/>
-              <w:spacing w:before="0" w:after="0" w:line="240" w:lineRule="auto"/>
-              <w:jc w:val="center"/>
-            </w:pPr>
-            <w:r>
-              <w:rPr>
-                <w:rFonts w:ascii="함초롬돋움" w:eastAsia="함초롬돋움" w:hAnsi="함초롬돋움" w:cs="함초롬돋움"/>
-                <w:b w:val="0"/>
-                <w:i w:val="0"/>
-                <w:sz w:val="18"/>
-              </w:rPr>
-              <w:t>+0.578 [+0.271, +0.889]</w:t>
+              <w:t>P − L</w:t>
+            </w:r>
+          </w:p>
+        </w:tc>
+        <w:tc>
+          <w:tcPr>
+            <w:tcW w:type="dxa" w:w="1755"/>
+            <w:vAlign w:val="center"/>
+          </w:tcPr>
+          <w:p>
+            <w:pPr>
+              <w:keepNext/>
+              <w:wordWrap/>
+              <w:spacing w:before="0" w:after="0" w:line="240" w:lineRule="auto"/>
+              <w:jc w:val="center"/>
+            </w:pPr>
+            <w:r>
+              <w:rPr>
+                <w:rFonts w:ascii="함초롬돋움" w:eastAsia="함초롬돋움" w:hAnsi="함초롬돋움" w:cs="함초롬돋움"/>
+                <w:b w:val="0"/>
+                <w:i w:val="0"/>
+                <w:sz w:val="18"/>
+              </w:rPr>
+              <w:t>+0.022</w:t>
+            </w:r>
+            <w:r>
+              <w:br/>
+            </w:r>
+            <w:r>
+              <w:rPr>
+                <w:rFonts w:ascii="함초롬돋움" w:eastAsia="함초롬돋움" w:hAnsi="함초롬돋움" w:cs="함초롬돋움"/>
+                <w:b w:val="0"/>
+                <w:i w:val="0"/>
+                <w:sz w:val="18"/>
+              </w:rPr>
+              <w:t>[+0.000, +0.067]</w:t>
+            </w:r>
+          </w:p>
+        </w:tc>
+        <w:tc>
+          <w:tcPr>
+            <w:tcW w:type="dxa" w:w="1755"/>
+            <w:vAlign w:val="center"/>
+          </w:tcPr>
+          <w:p>
+            <w:pPr>
+              <w:keepNext/>
+              <w:wordWrap/>
+              <w:spacing w:before="0" w:after="0" w:line="240" w:lineRule="auto"/>
+              <w:jc w:val="center"/>
+            </w:pPr>
+            <w:r>
+              <w:rPr>
+                <w:rFonts w:ascii="함초롬돋움" w:eastAsia="함초롬돋움" w:hAnsi="함초롬돋움" w:cs="함초롬돋움"/>
+                <w:b w:val="0"/>
+                <w:i w:val="0"/>
+                <w:sz w:val="18"/>
+              </w:rPr>
+              <w:t>+0.033</w:t>
+            </w:r>
+            <w:r>
+              <w:br/>
+            </w:r>
+            <w:r>
+              <w:rPr>
+                <w:rFonts w:ascii="함초롬돋움" w:eastAsia="함초롬돋움" w:hAnsi="함초롬돋움" w:cs="함초롬돋움"/>
+                <w:b w:val="0"/>
+                <w:i w:val="0"/>
+                <w:sz w:val="18"/>
+              </w:rPr>
+              <w:t>[+0.000, +0.100]</w:t>
             </w:r>
           </w:p>
         </w:tc>
@@ -1844,93 +1752,23 @@
         </w:trPr>
         <w:tc>
           <w:tcPr>
-            <w:tcW w:type="dxa" w:w="3061"/>
-            <w:vAlign w:val="center"/>
-          </w:tcPr>
-          <w:p>
-            <w:pPr>
-              <w:keepNext/>
-              <w:wordWrap/>
-              <w:spacing w:before="0" w:after="0" w:line="240" w:lineRule="auto"/>
-              <w:jc w:val="left"/>
-            </w:pPr>
-            <w:r>
-              <w:rPr>
-                <w:rFonts w:ascii="함초롬돋움" w:eastAsia="함초롬돋움" w:hAnsi="함초롬돋움" w:cs="함초롬돋움"/>
-                <w:b w:val="0"/>
-                <w:i w:val="0"/>
-                <w:sz w:val="18"/>
-              </w:rPr>
-              <w:t>llm_drafted (15/6)</w:t>
-            </w:r>
-          </w:p>
-        </w:tc>
-        <w:tc>
-          <w:tcPr>
-            <w:tcW w:type="dxa" w:w="2381"/>
-            <w:vAlign w:val="center"/>
-          </w:tcPr>
-          <w:p>
-            <w:pPr>
-              <w:keepNext/>
-              <w:wordWrap/>
-              <w:spacing w:before="0" w:after="0" w:line="240" w:lineRule="auto"/>
-              <w:jc w:val="center"/>
-            </w:pPr>
-            <w:r>
-              <w:rPr>
-                <w:rFonts w:ascii="함초롬돋움" w:eastAsia="함초롬돋움" w:hAnsi="함초롬돋움" w:cs="함초롬돋움"/>
-                <w:b w:val="0"/>
-                <w:i w:val="0"/>
-                <w:sz w:val="18"/>
-              </w:rPr>
-              <w:t>proposed − k3</w:t>
-            </w:r>
-          </w:p>
-        </w:tc>
-        <w:tc>
-          <w:tcPr>
-            <w:tcW w:type="dxa" w:w="2381"/>
-            <w:vAlign w:val="center"/>
-          </w:tcPr>
-          <w:p>
-            <w:pPr>
-              <w:keepNext/>
-              <w:wordWrap/>
-              <w:spacing w:before="0" w:after="0" w:line="240" w:lineRule="auto"/>
-              <w:jc w:val="center"/>
-            </w:pPr>
-            <w:r>
-              <w:rPr>
-                <w:rFonts w:ascii="함초롬돋움" w:eastAsia="함초롬돋움" w:hAnsi="함초롬돋움" w:cs="함초롬돋움"/>
-                <w:b w:val="0"/>
-                <w:i w:val="0"/>
-                <w:sz w:val="18"/>
-              </w:rPr>
-              <w:t>+0.244 [+0.098, +0.400]</w:t>
-            </w:r>
-          </w:p>
-        </w:tc>
-        <w:tc>
-          <w:tcPr>
-            <w:tcW w:type="dxa" w:w="2381"/>
-            <w:vAlign w:val="center"/>
-          </w:tcPr>
-          <w:p>
-            <w:pPr>
-              <w:keepNext/>
-              <w:wordWrap/>
-              <w:spacing w:before="0" w:after="0" w:line="240" w:lineRule="auto"/>
-              <w:jc w:val="center"/>
-            </w:pPr>
-            <w:r>
-              <w:rPr>
-                <w:rFonts w:ascii="함초롬돋움" w:eastAsia="함초롬돋움" w:hAnsi="함초롬돋움" w:cs="함초롬돋움"/>
-                <w:b w:val="0"/>
-                <w:i w:val="0"/>
-                <w:sz w:val="18"/>
-              </w:rPr>
-              <w:t>+0.511 [+0.246, +0.806]</w:t>
+            <w:tcW w:type="dxa" w:w="10773"/>
+            <w:gridSpan w:val="3"/>
+          </w:tcPr>
+          <w:p>
+            <w:pPr>
+              <w:keepNext/>
+              <w:wordWrap/>
+              <w:spacing w:before="0" w:after="0" w:line="240" w:lineRule="auto"/>
+            </w:pPr>
+            <w:r>
+              <w:rPr>
+                <w:rFonts w:ascii="함초롬돋움" w:eastAsia="함초롬돋움" w:hAnsi="함초롬돋움" w:cs="함초롬돋움"/>
+                <w:b/>
+                <w:i w:val="0"/>
+                <w:sz w:val="18"/>
+              </w:rPr>
+              <w:t>llm_drafted (사례 15/군집 6)</w:t>
             </w:r>
           </w:p>
         </w:tc>
@@ -1941,7 +1779,203 @@
         </w:trPr>
         <w:tc>
           <w:tcPr>
-            <w:tcW w:type="dxa" w:w="3061"/>
+            <w:tcW w:type="dxa" w:w="1365"/>
+            <w:vAlign w:val="center"/>
+          </w:tcPr>
+          <w:p>
+            <w:pPr>
+              <w:keepNext/>
+              <w:wordWrap/>
+              <w:spacing w:before="0" w:after="0" w:line="240" w:lineRule="auto"/>
+              <w:jc w:val="left"/>
+            </w:pPr>
+            <w:r>
+              <w:rPr>
+                <w:rFonts w:ascii="함초롬돋움" w:eastAsia="함초롬돋움" w:hAnsi="함초롬돋움" w:cs="함초롬돋움"/>
+                <w:b w:val="0"/>
+                <w:i w:val="0"/>
+                <w:sz w:val="18"/>
+              </w:rPr>
+              <w:t>L − K3</w:t>
+            </w:r>
+          </w:p>
+        </w:tc>
+        <w:tc>
+          <w:tcPr>
+            <w:tcW w:type="dxa" w:w="1755"/>
+            <w:vAlign w:val="center"/>
+          </w:tcPr>
+          <w:p>
+            <w:pPr>
+              <w:keepNext/>
+              <w:wordWrap/>
+              <w:spacing w:before="0" w:after="0" w:line="240" w:lineRule="auto"/>
+              <w:jc w:val="center"/>
+            </w:pPr>
+            <w:r>
+              <w:rPr>
+                <w:rFonts w:ascii="함초롬돋움" w:eastAsia="함초롬돋움" w:hAnsi="함초롬돋움" w:cs="함초롬돋움"/>
+                <w:b w:val="0"/>
+                <w:i w:val="0"/>
+                <w:sz w:val="18"/>
+              </w:rPr>
+              <w:t>+0.267</w:t>
+            </w:r>
+            <w:r>
+              <w:br/>
+            </w:r>
+            <w:r>
+              <w:rPr>
+                <w:rFonts w:ascii="함초롬돋움" w:eastAsia="함초롬돋움" w:hAnsi="함초롬돋움" w:cs="함초롬돋움"/>
+                <w:b w:val="0"/>
+                <w:i w:val="0"/>
+                <w:sz w:val="18"/>
+              </w:rPr>
+              <w:t>[+0.083, +0.440]</w:t>
+            </w:r>
+          </w:p>
+        </w:tc>
+        <w:tc>
+          <w:tcPr>
+            <w:tcW w:type="dxa" w:w="1755"/>
+            <w:vAlign w:val="center"/>
+          </w:tcPr>
+          <w:p>
+            <w:pPr>
+              <w:keepNext/>
+              <w:wordWrap/>
+              <w:spacing w:before="0" w:after="0" w:line="240" w:lineRule="auto"/>
+              <w:jc w:val="center"/>
+            </w:pPr>
+            <w:r>
+              <w:rPr>
+                <w:rFonts w:ascii="함초롬돋움" w:eastAsia="함초롬돋움" w:hAnsi="함초롬돋움" w:cs="함초롬돋움"/>
+                <w:b w:val="0"/>
+                <w:i w:val="0"/>
+                <w:sz w:val="18"/>
+              </w:rPr>
+              <w:t>+0.578</w:t>
+            </w:r>
+            <w:r>
+              <w:br/>
+            </w:r>
+            <w:r>
+              <w:rPr>
+                <w:rFonts w:ascii="함초롬돋움" w:eastAsia="함초롬돋움" w:hAnsi="함초롬돋움" w:cs="함초롬돋움"/>
+                <w:b w:val="0"/>
+                <w:i w:val="0"/>
+                <w:sz w:val="18"/>
+              </w:rPr>
+              <w:t>[+0.271, +0.889]</w:t>
+            </w:r>
+          </w:p>
+        </w:tc>
+      </w:tr>
+      <w:tr>
+        <w:trPr>
+          <w:cantSplit/>
+        </w:trPr>
+        <w:tc>
+          <w:tcPr>
+            <w:tcW w:type="dxa" w:w="1365"/>
+            <w:vAlign w:val="center"/>
+          </w:tcPr>
+          <w:p>
+            <w:pPr>
+              <w:keepNext/>
+              <w:wordWrap/>
+              <w:spacing w:before="0" w:after="0" w:line="240" w:lineRule="auto"/>
+              <w:jc w:val="left"/>
+            </w:pPr>
+            <w:r>
+              <w:rPr>
+                <w:rFonts w:ascii="함초롬돋움" w:eastAsia="함초롬돋움" w:hAnsi="함초롬돋움" w:cs="함초롬돋움"/>
+                <w:b w:val="0"/>
+                <w:i w:val="0"/>
+                <w:sz w:val="18"/>
+              </w:rPr>
+              <w:t>P − K3</w:t>
+            </w:r>
+          </w:p>
+        </w:tc>
+        <w:tc>
+          <w:tcPr>
+            <w:tcW w:type="dxa" w:w="1755"/>
+            <w:vAlign w:val="center"/>
+          </w:tcPr>
+          <w:p>
+            <w:pPr>
+              <w:keepNext/>
+              <w:wordWrap/>
+              <w:spacing w:before="0" w:after="0" w:line="240" w:lineRule="auto"/>
+              <w:jc w:val="center"/>
+            </w:pPr>
+            <w:r>
+              <w:rPr>
+                <w:rFonts w:ascii="함초롬돋움" w:eastAsia="함초롬돋움" w:hAnsi="함초롬돋움" w:cs="함초롬돋움"/>
+                <w:b w:val="0"/>
+                <w:i w:val="0"/>
+                <w:sz w:val="18"/>
+              </w:rPr>
+              <w:t>+0.244</w:t>
+            </w:r>
+            <w:r>
+              <w:br/>
+            </w:r>
+            <w:r>
+              <w:rPr>
+                <w:rFonts w:ascii="함초롬돋움" w:eastAsia="함초롬돋움" w:hAnsi="함초롬돋움" w:cs="함초롬돋움"/>
+                <w:b w:val="0"/>
+                <w:i w:val="0"/>
+                <w:sz w:val="18"/>
+              </w:rPr>
+              <w:t>[+0.098, +0.400]</w:t>
+            </w:r>
+          </w:p>
+        </w:tc>
+        <w:tc>
+          <w:tcPr>
+            <w:tcW w:type="dxa" w:w="1755"/>
+            <w:vAlign w:val="center"/>
+          </w:tcPr>
+          <w:p>
+            <w:pPr>
+              <w:keepNext/>
+              <w:wordWrap/>
+              <w:spacing w:before="0" w:after="0" w:line="240" w:lineRule="auto"/>
+              <w:jc w:val="center"/>
+            </w:pPr>
+            <w:r>
+              <w:rPr>
+                <w:rFonts w:ascii="함초롬돋움" w:eastAsia="함초롬돋움" w:hAnsi="함초롬돋움" w:cs="함초롬돋움"/>
+                <w:b w:val="0"/>
+                <w:i w:val="0"/>
+                <w:sz w:val="18"/>
+              </w:rPr>
+              <w:t>+0.511</w:t>
+            </w:r>
+            <w:r>
+              <w:br/>
+            </w:r>
+            <w:r>
+              <w:rPr>
+                <w:rFonts w:ascii="함초롬돋움" w:eastAsia="함초롬돋움" w:hAnsi="함초롬돋움" w:cs="함초롬돋움"/>
+                <w:b w:val="0"/>
+                <w:i w:val="0"/>
+                <w:sz w:val="18"/>
+              </w:rPr>
+              <w:t>[+0.246, +0.806]</w:t>
+            </w:r>
+          </w:p>
+        </w:tc>
+      </w:tr>
+      <w:tr>
+        <w:trPr>
+          <w:cantSplit/>
+        </w:trPr>
+        <w:tc>
+          <w:tcPr>
+            <w:tcW w:type="dxa" w:w="1365"/>
             <w:vAlign w:val="center"/>
           </w:tcPr>
           <w:p>
@@ -1958,13 +1992,13 @@
                 <w:i w:val="0"/>
                 <w:sz w:val="18"/>
               </w:rPr>
-              <w:t>llm_drafted (15/6)</w:t>
-            </w:r>
-          </w:p>
-        </w:tc>
-        <w:tc>
-          <w:tcPr>
-            <w:tcW w:type="dxa" w:w="2381"/>
+              <w:t>P − L</w:t>
+            </w:r>
+          </w:p>
+        </w:tc>
+        <w:tc>
+          <w:tcPr>
+            <w:tcW w:type="dxa" w:w="1755"/>
             <w:vAlign w:val="center"/>
           </w:tcPr>
           <w:p>
@@ -1981,13 +2015,25 @@
                 <w:i w:val="0"/>
                 <w:sz w:val="18"/>
               </w:rPr>
-              <w:t>proposed − link_all</w:t>
-            </w:r>
-          </w:p>
-        </w:tc>
-        <w:tc>
-          <w:tcPr>
-            <w:tcW w:type="dxa" w:w="2381"/>
+              <w:t>−0.022</w:t>
+            </w:r>
+            <w:r>
+              <w:br/>
+            </w:r>
+            <w:r>
+              <w:rPr>
+                <w:rFonts w:ascii="함초롬돋움" w:eastAsia="함초롬돋움" w:hAnsi="함초롬돋움" w:cs="함초롬돋움"/>
+                <w:b w:val="0"/>
+                <w:i w:val="0"/>
+                <w:sz w:val="18"/>
+              </w:rPr>
+              <w:t>[−0.083, +0.026]</w:t>
+            </w:r>
+          </w:p>
+        </w:tc>
+        <w:tc>
+          <w:tcPr>
+            <w:tcW w:type="dxa" w:w="1755"/>
             <w:vAlign w:val="center"/>
           </w:tcPr>
           <w:p>
@@ -2004,30 +2050,19 @@
                 <w:i w:val="0"/>
                 <w:sz w:val="18"/>
               </w:rPr>
-              <w:t>−0.022 [−0.083, +0.026]</w:t>
-            </w:r>
-          </w:p>
-        </w:tc>
-        <w:tc>
-          <w:tcPr>
-            <w:tcW w:type="dxa" w:w="2381"/>
-            <w:vAlign w:val="center"/>
-          </w:tcPr>
-          <w:p>
-            <w:pPr>
-              <w:keepNext w:val="0"/>
-              <w:wordWrap/>
-              <w:spacing w:before="0" w:after="0" w:line="240" w:lineRule="auto"/>
-              <w:jc w:val="center"/>
-            </w:pPr>
-            <w:r>
-              <w:rPr>
-                <w:rFonts w:ascii="함초롬돋움" w:eastAsia="함초롬돋움" w:hAnsi="함초롬돋움" w:cs="함초롬돋움"/>
-                <w:b w:val="0"/>
-                <w:i w:val="0"/>
-                <w:sz w:val="18"/>
-              </w:rPr>
-              <w:t>−0.067 [−0.167, 0.000]</w:t>
+              <w:t>−0.067</w:t>
+            </w:r>
+            <w:r>
+              <w:br/>
+            </w:r>
+            <w:r>
+              <w:rPr>
+                <w:rFonts w:ascii="함초롬돋움" w:eastAsia="함초롬돋움" w:hAnsi="함초롬돋움" w:cs="함초롬돋움"/>
+                <w:b w:val="0"/>
+                <w:i w:val="0"/>
+                <w:sz w:val="18"/>
+              </w:rPr>
+              <w:t>[−0.167, 0.000]</w:t>
             </w:r>
           </w:p>
         </w:tc>
@@ -2035,17 +2070,6 @@
     </w:tbl>
     <w:p>
       <w:pPr>
-        <w:sectPr>
-          <w:type w:val="continuous"/>
-          <w:pgSz w:w="11906" w:h="16838" w:code="9"/>
-          <w:pgMar w:top="1701" w:right="567" w:bottom="1134" w:left="567" w:header="0" w:footer="0" w:gutter="0"/>
-          <w:cols w:num="1" w:space="720"/>
-          <w:docGrid w:type="lines" w:linePitch="280"/>
-        </w:sectPr>
-      </w:pPr>
-    </w:p>
-    <w:p>
-      <w:pPr>
         <w:wordWrap/>
         <w:spacing w:before="0" w:after="0" w:line="120" w:lineRule="exact"/>
       </w:pPr>
@@ -2065,17 +2089,6 @@
         </w:rPr>
         <w:t>군집은 같은 via_link 정답 끝점(문서 버전, 조항)을 공유하는 사례의 연결요소로 묶었으며, link ID가 없어 끝점 공유를 대리 지표로 썼다. 5개 개발·6개 신규 군집은 작아 CI는 확증적 추론이 아니다. 신규 그래프 15건은 승인 링크와 양 끝 원문에서 초안되어 해당 링크에 조건부인 표본이다.</w:t>
       </w:r>
-    </w:p>
-    <w:p>
-      <w:pPr>
-        <w:sectPr>
-          <w:type w:val="continuous"/>
-          <w:pgSz w:w="11906" w:h="16838" w:code="9"/>
-          <w:pgMar w:top="1701" w:right="567" w:bottom="1134" w:left="567" w:header="0" w:footer="0" w:gutter="0"/>
-          <w:cols w:num="2" w:space="720"/>
-          <w:docGrid w:type="lines" w:linePitch="280"/>
-        </w:sectPr>
-      </w:pPr>
     </w:p>
     <w:p>
       <w:pPr>
@@ -2091,7 +2104,7 @@
           <w:i w:val="0"/>
           <w:sz w:val="18"/>
         </w:rPr>
-        <w:t>표 3. proposed − link_all의 출처별 문맥·답변·지연 차이 (CI는 링크 끝점 군집 bootstrap이며 탐색적이다).</w:t>
+        <w:t>표 3. proposed − link_all의 출처별 문맥·답변·지연 차이 (끝점 군집 bootstrap 95% CI, 탐색적).</w:t>
       </w:r>
     </w:p>
     <w:tbl>
@@ -2108,12 +2121,15 @@
           <w:insideH w:val="single" w:sz="4" w:space="0" w:color="000000"/>
           <w:insideV w:val="single" w:sz="4" w:space="0" w:color="000000"/>
         </w:tblBorders>
+        <w:tblCellMar>
+          <w:left w:w="57" w:type="dxa"/>
+          <w:right w:w="57" w:type="dxa"/>
+        </w:tblCellMar>
       </w:tblPr>
       <w:tblGrid>
-        <w:gridCol w:w="3061"/>
-        <w:gridCol w:w="2381"/>
-        <w:gridCol w:w="2381"/>
-        <w:gridCol w:w="2381"/>
+        <w:gridCol w:w="1365"/>
+        <w:gridCol w:w="1755"/>
+        <w:gridCol w:w="1755"/>
       </w:tblGrid>
       <w:tr>
         <w:trPr>
@@ -2122,7 +2138,7 @@
         </w:trPr>
         <w:tc>
           <w:tcPr>
-            <w:tcW w:type="dxa" w:w="3061"/>
+            <w:tcW w:type="dxa" w:w="1365"/>
             <w:vAlign w:val="center"/>
           </w:tcPr>
           <w:p>
@@ -2139,13 +2155,13 @@
                 <w:i w:val="0"/>
                 <w:sz w:val="18"/>
               </w:rPr>
-              <w:t>출처 (사례/군집)</w:t>
-            </w:r>
-          </w:p>
-        </w:tc>
-        <w:tc>
-          <w:tcPr>
-            <w:tcW w:type="dxa" w:w="2381"/>
+              <w:t>지표</w:t>
+            </w:r>
+          </w:p>
+        </w:tc>
+        <w:tc>
+          <w:tcPr>
+            <w:tcW w:type="dxa" w:w="1755"/>
             <w:vAlign w:val="center"/>
           </w:tcPr>
           <w:p>
@@ -2162,22 +2178,11 @@
                 <w:i w:val="0"/>
                 <w:sz w:val="18"/>
               </w:rPr>
-              <w:t>ΔContext Precision [95% CI]</w:t>
-            </w:r>
-          </w:p>
-        </w:tc>
-        <w:tc>
-          <w:tcPr>
-            <w:tcW w:type="dxa" w:w="2381"/>
-            <w:vAlign w:val="center"/>
-          </w:tcPr>
-          <w:p>
-            <w:pPr>
-              <w:keepNext/>
-              <w:wordWrap/>
-              <w:spacing w:before="0" w:after="0" w:line="240" w:lineRule="auto"/>
-              <w:jc w:val="center"/>
-            </w:pPr>
+              <w:t>existing_v2</w:t>
+            </w:r>
+            <w:r>
+              <w:br/>
+            </w:r>
             <w:r>
               <w:rPr>
                 <w:rFonts w:ascii="함초롬돋움" w:eastAsia="함초롬돋움" w:hAnsi="함초롬돋움" w:cs="함초롬돋움"/>
@@ -2185,13 +2190,13 @@
                 <w:i w:val="0"/>
                 <w:sz w:val="18"/>
               </w:rPr>
-              <w:t>ΔAnswer Correctness [95% CI]</w:t>
-            </w:r>
-          </w:p>
-        </w:tc>
-        <w:tc>
-          <w:tcPr>
-            <w:tcW w:type="dxa" w:w="2381"/>
+              <w:t>(5/5)</w:t>
+            </w:r>
+          </w:p>
+        </w:tc>
+        <w:tc>
+          <w:tcPr>
+            <w:tcW w:type="dxa" w:w="1755"/>
             <w:vAlign w:val="center"/>
           </w:tcPr>
           <w:p>
@@ -2208,7 +2213,19 @@
                 <w:i w:val="0"/>
                 <w:sz w:val="18"/>
               </w:rPr>
-              <w:t>Δ지연 (초/질의) [95% CI]</w:t>
+              <w:t>llm_drafted</w:t>
+            </w:r>
+            <w:r>
+              <w:br/>
+            </w:r>
+            <w:r>
+              <w:rPr>
+                <w:rFonts w:ascii="함초롬돋움" w:eastAsia="함초롬돋움" w:hAnsi="함초롬돋움" w:cs="함초롬돋움"/>
+                <w:b/>
+                <w:i w:val="0"/>
+                <w:sz w:val="18"/>
+              </w:rPr>
+              <w:t>(15/6)</w:t>
             </w:r>
           </w:p>
         </w:tc>
@@ -2219,7 +2236,7 @@
         </w:trPr>
         <w:tc>
           <w:tcPr>
-            <w:tcW w:type="dxa" w:w="3061"/>
+            <w:tcW w:type="dxa" w:w="1365"/>
             <w:vAlign w:val="center"/>
           </w:tcPr>
           <w:p>
@@ -2236,76 +2253,89 @@
                 <w:i w:val="0"/>
                 <w:sz w:val="18"/>
               </w:rPr>
-              <w:t>existing_v2 (5/5)</w:t>
-            </w:r>
-          </w:p>
-        </w:tc>
-        <w:tc>
-          <w:tcPr>
-            <w:tcW w:type="dxa" w:w="2381"/>
-            <w:vAlign w:val="center"/>
-          </w:tcPr>
-          <w:p>
-            <w:pPr>
-              <w:keepNext/>
-              <w:wordWrap/>
-              <w:spacing w:before="0" w:after="0" w:line="240" w:lineRule="auto"/>
-              <w:jc w:val="center"/>
-            </w:pPr>
-            <w:r>
-              <w:rPr>
-                <w:rFonts w:ascii="함초롬돋움" w:eastAsia="함초롬돋움" w:hAnsi="함초롬돋움" w:cs="함초롬돋움"/>
-                <w:b w:val="0"/>
-                <w:i w:val="0"/>
-                <w:sz w:val="18"/>
-              </w:rPr>
-              <w:t>+0.109 [+0.002, +0.220]</w:t>
-            </w:r>
-          </w:p>
-        </w:tc>
-        <w:tc>
-          <w:tcPr>
-            <w:tcW w:type="dxa" w:w="2381"/>
-            <w:vAlign w:val="center"/>
-          </w:tcPr>
-          <w:p>
-            <w:pPr>
-              <w:keepNext/>
-              <w:wordWrap/>
-              <w:spacing w:before="0" w:after="0" w:line="240" w:lineRule="auto"/>
-              <w:jc w:val="center"/>
-            </w:pPr>
-            <w:r>
-              <w:rPr>
-                <w:rFonts w:ascii="함초롬돋움" w:eastAsia="함초롬돋움" w:hAnsi="함초롬돋움" w:cs="함초롬돋움"/>
-                <w:b w:val="0"/>
-                <w:i w:val="0"/>
-                <w:sz w:val="18"/>
-              </w:rPr>
-              <w:t>−0.003 [−0.040, +0.042]</w:t>
-            </w:r>
-          </w:p>
-        </w:tc>
-        <w:tc>
-          <w:tcPr>
-            <w:tcW w:type="dxa" w:w="2381"/>
-            <w:vAlign w:val="center"/>
-          </w:tcPr>
-          <w:p>
-            <w:pPr>
-              <w:keepNext/>
-              <w:wordWrap/>
-              <w:spacing w:before="0" w:after="0" w:line="240" w:lineRule="auto"/>
-              <w:jc w:val="center"/>
-            </w:pPr>
-            <w:r>
-              <w:rPr>
-                <w:rFonts w:ascii="함초롬돋움" w:eastAsia="함초롬돋움" w:hAnsi="함초롬돋움" w:cs="함초롬돋움"/>
-                <w:b w:val="0"/>
-                <w:i w:val="0"/>
-                <w:sz w:val="18"/>
-              </w:rPr>
-              <w:t>+1.057 [+0.904, +1.211]</w:t>
+              <w:t>ΔContext</w:t>
+            </w:r>
+            <w:r>
+              <w:br/>
+            </w:r>
+            <w:r>
+              <w:rPr>
+                <w:rFonts w:ascii="함초롬돋움" w:eastAsia="함초롬돋움" w:hAnsi="함초롬돋움" w:cs="함초롬돋움"/>
+                <w:b w:val="0"/>
+                <w:i w:val="0"/>
+                <w:sz w:val="18"/>
+              </w:rPr>
+              <w:t>Precision</w:t>
+            </w:r>
+          </w:p>
+        </w:tc>
+        <w:tc>
+          <w:tcPr>
+            <w:tcW w:type="dxa" w:w="1755"/>
+            <w:vAlign w:val="center"/>
+          </w:tcPr>
+          <w:p>
+            <w:pPr>
+              <w:keepNext/>
+              <w:wordWrap/>
+              <w:spacing w:before="0" w:after="0" w:line="240" w:lineRule="auto"/>
+              <w:jc w:val="center"/>
+            </w:pPr>
+            <w:r>
+              <w:rPr>
+                <w:rFonts w:ascii="함초롬돋움" w:eastAsia="함초롬돋움" w:hAnsi="함초롬돋움" w:cs="함초롬돋움"/>
+                <w:b w:val="0"/>
+                <w:i w:val="0"/>
+                <w:sz w:val="18"/>
+              </w:rPr>
+              <w:t>+0.109</w:t>
+            </w:r>
+            <w:r>
+              <w:br/>
+            </w:r>
+            <w:r>
+              <w:rPr>
+                <w:rFonts w:ascii="함초롬돋움" w:eastAsia="함초롬돋움" w:hAnsi="함초롬돋움" w:cs="함초롬돋움"/>
+                <w:b w:val="0"/>
+                <w:i w:val="0"/>
+                <w:sz w:val="18"/>
+              </w:rPr>
+              <w:t>[+0.002, +0.220]</w:t>
+            </w:r>
+          </w:p>
+        </w:tc>
+        <w:tc>
+          <w:tcPr>
+            <w:tcW w:type="dxa" w:w="1755"/>
+            <w:vAlign w:val="center"/>
+          </w:tcPr>
+          <w:p>
+            <w:pPr>
+              <w:keepNext/>
+              <w:wordWrap/>
+              <w:spacing w:before="0" w:after="0" w:line="240" w:lineRule="auto"/>
+              <w:jc w:val="center"/>
+            </w:pPr>
+            <w:r>
+              <w:rPr>
+                <w:rFonts w:ascii="함초롬돋움" w:eastAsia="함초롬돋움" w:hAnsi="함초롬돋움" w:cs="함초롬돋움"/>
+                <w:b w:val="0"/>
+                <w:i w:val="0"/>
+                <w:sz w:val="18"/>
+              </w:rPr>
+              <w:t>+0.025</w:t>
+            </w:r>
+            <w:r>
+              <w:br/>
+            </w:r>
+            <w:r>
+              <w:rPr>
+                <w:rFonts w:ascii="함초롬돋움" w:eastAsia="함초롬돋움" w:hAnsi="함초롬돋움" w:cs="함초롬돋움"/>
+                <w:b w:val="0"/>
+                <w:i w:val="0"/>
+                <w:sz w:val="18"/>
+              </w:rPr>
+              <w:t>[+0.008, +0.042]</w:t>
             </w:r>
           </w:p>
         </w:tc>
@@ -2316,7 +2346,117 @@
         </w:trPr>
         <w:tc>
           <w:tcPr>
-            <w:tcW w:type="dxa" w:w="3061"/>
+            <w:tcW w:type="dxa" w:w="1365"/>
+            <w:vAlign w:val="center"/>
+          </w:tcPr>
+          <w:p>
+            <w:pPr>
+              <w:keepNext/>
+              <w:wordWrap/>
+              <w:spacing w:before="0" w:after="0" w:line="240" w:lineRule="auto"/>
+              <w:jc w:val="left"/>
+            </w:pPr>
+            <w:r>
+              <w:rPr>
+                <w:rFonts w:ascii="함초롬돋움" w:eastAsia="함초롬돋움" w:hAnsi="함초롬돋움" w:cs="함초롬돋움"/>
+                <w:b w:val="0"/>
+                <w:i w:val="0"/>
+                <w:sz w:val="18"/>
+              </w:rPr>
+              <w:t>ΔAnswer</w:t>
+            </w:r>
+            <w:r>
+              <w:br/>
+            </w:r>
+            <w:r>
+              <w:rPr>
+                <w:rFonts w:ascii="함초롬돋움" w:eastAsia="함초롬돋움" w:hAnsi="함초롬돋움" w:cs="함초롬돋움"/>
+                <w:b w:val="0"/>
+                <w:i w:val="0"/>
+                <w:sz w:val="18"/>
+              </w:rPr>
+              <w:t>Correctness</w:t>
+            </w:r>
+          </w:p>
+        </w:tc>
+        <w:tc>
+          <w:tcPr>
+            <w:tcW w:type="dxa" w:w="1755"/>
+            <w:vAlign w:val="center"/>
+          </w:tcPr>
+          <w:p>
+            <w:pPr>
+              <w:keepNext/>
+              <w:wordWrap/>
+              <w:spacing w:before="0" w:after="0" w:line="240" w:lineRule="auto"/>
+              <w:jc w:val="center"/>
+            </w:pPr>
+            <w:r>
+              <w:rPr>
+                <w:rFonts w:ascii="함초롬돋움" w:eastAsia="함초롬돋움" w:hAnsi="함초롬돋움" w:cs="함초롬돋움"/>
+                <w:b w:val="0"/>
+                <w:i w:val="0"/>
+                <w:sz w:val="18"/>
+              </w:rPr>
+              <w:t>−0.003</w:t>
+            </w:r>
+            <w:r>
+              <w:br/>
+            </w:r>
+            <w:r>
+              <w:rPr>
+                <w:rFonts w:ascii="함초롬돋움" w:eastAsia="함초롬돋움" w:hAnsi="함초롬돋움" w:cs="함초롬돋움"/>
+                <w:b w:val="0"/>
+                <w:i w:val="0"/>
+                <w:sz w:val="18"/>
+              </w:rPr>
+              <w:t>[−0.040, +0.042]</w:t>
+            </w:r>
+          </w:p>
+        </w:tc>
+        <w:tc>
+          <w:tcPr>
+            <w:tcW w:type="dxa" w:w="1755"/>
+            <w:vAlign w:val="center"/>
+          </w:tcPr>
+          <w:p>
+            <w:pPr>
+              <w:keepNext/>
+              <w:wordWrap/>
+              <w:spacing w:before="0" w:after="0" w:line="240" w:lineRule="auto"/>
+              <w:jc w:val="center"/>
+            </w:pPr>
+            <w:r>
+              <w:rPr>
+                <w:rFonts w:ascii="함초롬돋움" w:eastAsia="함초롬돋움" w:hAnsi="함초롬돋움" w:cs="함초롬돋움"/>
+                <w:b w:val="0"/>
+                <w:i w:val="0"/>
+                <w:sz w:val="18"/>
+              </w:rPr>
+              <w:t>−0.001</w:t>
+            </w:r>
+            <w:r>
+              <w:br/>
+            </w:r>
+            <w:r>
+              <w:rPr>
+                <w:rFonts w:ascii="함초롬돋움" w:eastAsia="함초롬돋움" w:hAnsi="함초롬돋움" w:cs="함초롬돋움"/>
+                <w:b w:val="0"/>
+                <w:i w:val="0"/>
+                <w:sz w:val="18"/>
+              </w:rPr>
+              <w:t>[−0.019, +0.018]</w:t>
+            </w:r>
+          </w:p>
+        </w:tc>
+      </w:tr>
+      <w:tr>
+        <w:trPr>
+          <w:cantSplit/>
+        </w:trPr>
+        <w:tc>
+          <w:tcPr>
+            <w:tcW w:type="dxa" w:w="1365"/>
             <w:vAlign w:val="center"/>
           </w:tcPr>
           <w:p>
@@ -2333,13 +2473,25 @@
                 <w:i w:val="0"/>
                 <w:sz w:val="18"/>
               </w:rPr>
-              <w:t>llm_drafted (15/6)</w:t>
-            </w:r>
-          </w:p>
-        </w:tc>
-        <w:tc>
-          <w:tcPr>
-            <w:tcW w:type="dxa" w:w="2381"/>
+              <w:t>Δ지연</w:t>
+            </w:r>
+            <w:r>
+              <w:br/>
+            </w:r>
+            <w:r>
+              <w:rPr>
+                <w:rFonts w:ascii="함초롬돋움" w:eastAsia="함초롬돋움" w:hAnsi="함초롬돋움" w:cs="함초롬돋움"/>
+                <w:b w:val="0"/>
+                <w:i w:val="0"/>
+                <w:sz w:val="18"/>
+              </w:rPr>
+              <w:t>(초/질의)</w:t>
+            </w:r>
+          </w:p>
+        </w:tc>
+        <w:tc>
+          <w:tcPr>
+            <w:tcW w:type="dxa" w:w="1755"/>
             <w:vAlign w:val="center"/>
           </w:tcPr>
           <w:p>
@@ -2356,13 +2508,25 @@
                 <w:i w:val="0"/>
                 <w:sz w:val="18"/>
               </w:rPr>
-              <w:t>+0.025 [+0.008, +0.042]</w:t>
-            </w:r>
-          </w:p>
-        </w:tc>
-        <w:tc>
-          <w:tcPr>
-            <w:tcW w:type="dxa" w:w="2381"/>
+              <w:t>+1.057</w:t>
+            </w:r>
+            <w:r>
+              <w:br/>
+            </w:r>
+            <w:r>
+              <w:rPr>
+                <w:rFonts w:ascii="함초롬돋움" w:eastAsia="함초롬돋움" w:hAnsi="함초롬돋움" w:cs="함초롬돋움"/>
+                <w:b w:val="0"/>
+                <w:i w:val="0"/>
+                <w:sz w:val="18"/>
+              </w:rPr>
+              <w:t>[+0.904, +1.211]</w:t>
+            </w:r>
+          </w:p>
+        </w:tc>
+        <w:tc>
+          <w:tcPr>
+            <w:tcW w:type="dxa" w:w="1755"/>
             <w:vAlign w:val="center"/>
           </w:tcPr>
           <w:p>
@@ -2379,46 +2543,24 @@
                 <w:i w:val="0"/>
                 <w:sz w:val="18"/>
               </w:rPr>
-              <w:t>−0.001 [−0.019, +0.018]</w:t>
-            </w:r>
-          </w:p>
-        </w:tc>
-        <w:tc>
-          <w:tcPr>
-            <w:tcW w:type="dxa" w:w="2381"/>
-            <w:vAlign w:val="center"/>
-          </w:tcPr>
-          <w:p>
-            <w:pPr>
-              <w:keepNext w:val="0"/>
-              <w:wordWrap/>
-              <w:spacing w:before="0" w:after="0" w:line="240" w:lineRule="auto"/>
-              <w:jc w:val="center"/>
-            </w:pPr>
-            <w:r>
-              <w:rPr>
-                <w:rFonts w:ascii="함초롬돋움" w:eastAsia="함초롬돋움" w:hAnsi="함초롬돋움" w:cs="함초롬돋움"/>
-                <w:b w:val="0"/>
-                <w:i w:val="0"/>
-                <w:sz w:val="18"/>
-              </w:rPr>
-              <w:t>+0.343 [−0.761, +1.066]</w:t>
+              <w:t>+0.343</w:t>
+            </w:r>
+            <w:r>
+              <w:br/>
+            </w:r>
+            <w:r>
+              <w:rPr>
+                <w:rFonts w:ascii="함초롬돋움" w:eastAsia="함초롬돋움" w:hAnsi="함초롬돋움" w:cs="함초롬돋움"/>
+                <w:b w:val="0"/>
+                <w:i w:val="0"/>
+                <w:sz w:val="18"/>
+              </w:rPr>
+              <w:t>[−0.761, +1.066]</w:t>
             </w:r>
           </w:p>
         </w:tc>
       </w:tr>
     </w:tbl>
-    <w:p>
-      <w:pPr>
-        <w:sectPr>
-          <w:type w:val="continuous"/>
-          <w:pgSz w:w="11906" w:h="16838" w:code="9"/>
-          <w:pgMar w:top="1701" w:right="567" w:bottom="1134" w:left="567" w:header="0" w:footer="0" w:gutter="0"/>
-          <w:cols w:num="1" w:space="720"/>
-          <w:docGrid w:type="lines" w:linePitch="280"/>
-        </w:sectPr>
-      </w:pPr>
-    </w:p>
     <w:p>
       <w:pPr>
         <w:wordWrap/>

</xml_diff>

<commit_message>
paper: apply Google Docs revision to KIISE form (v2)
</commit_message>
<xml_diff>
--- a/paper/final/final_draft_v2.docx
+++ b/paper/final/final_draft_v2.docx
@@ -76,7 +76,9 @@
                 <w:sz w:val="32"/>
                 <w:szCs w:val="32"/>
               </w:rPr>
-              <w:t xml:space="preserve">사람 승인 교차문서 링크를 이용한 철도 규정 근거 검색 향상</w:t>
+              <w:t xml:space="preserve">철도 규정 질의응답을 위한</w:t>
+              <w:br/>
+              <w:t xml:space="preserve">승인 기반 교차문서 근거 검색</w:t>
             </w:r>
           </w:p>
         </w:tc>
@@ -165,7 +167,9 @@
                 <w:sz w:val="28"/>
                 <w:szCs w:val="32"/>
               </w:rPr>
-              <w:t xml:space="preserve">Improving Evidence Retrieval for Railway Regulation QA with Human-Approved Cross-Document Links</w:t>
+              <w:t xml:space="preserve">Approval-Based Cross-Document Evidence Retrieval</w:t>
+              <w:br/>
+              <w:t xml:space="preserve">for Railway Regulation Question Answering</w:t>
             </w:r>
           </w:p>
         </w:tc>
@@ -259,7 +263,7 @@
                 <w:rFonts w:ascii="함초롬돋움" w:eastAsia="함초롬돋움" w:hAnsi="함초롬돋움" w:cs="함초롬돋움"/>
                 <w:szCs w:val="18"/>
               </w:rPr>
-              <w:t xml:space="preserve">철도 규정 질의는 현장 길라잡이의 구체 절차와 규정의 보고·운전 조건을 함께 요구할 수 있다. 본 연구는 관리자가 연결한 문서 구간 링크를 검색 확장 경계로 평가하고, 연결 근거 선택 재정렬은 부차 분석으로 둔다. link_all−hybrid_rerank_k3의 그래프 Recall 차이는 개발 사례에서 +0.128, 신규 사례에서 +0.267이며 군집 구간으로 기술한다. 정답 라벨은 철도 운영기관 현업 전문가 1인의 체크리스트 검수를 거쳤지만, 신규 표본은 링크 구성에 조건부이므로 탐색적으로 해석한다.</w:t>
+              <w:t xml:space="preserve">철도 규정 질의에 정확하게 답변하기 위해 AI 시스템은 현장 길라잡이에 제시된 구체적인 조치 절차와 내부 규정의 보고·운전 조건을 함께 검색해야 한다. 본 연구는 관리자가 연결하고 승인한 문서 간 링크를 활용해 검색 결과를 확장하는 효과를 평가하고, 연결 근거의 선별 재정렬은 부차적으로 분석한다. 그래프형 질의에서 link_all과 hybrid_rerank_k3의 Recall 차이는 기존 사례에서 +0.128, 링크 기반 생성 사례에서 +0.267이다. 결과는 군집 단위 부트스트랩 신뢰구간과 함께 제시한다. 생성 사례 20건은 철도 운영기관 현업 전문가 1인의 체크리스트 검수를 거쳤다. 다만 생성 사례는 링크를 전제로 구성되었으므로 결과를 보수적으로 해석한다.</w:t>
             </w:r>
           </w:p>
           <w:p>
@@ -319,7 +323,7 @@
           <w:i w:val="0"/>
           <w:sz w:val="20"/>
         </w:rPr>
-        <w:t>기관사와 관제원이 설비 고장 대응을 확인할 때는 길라잡이의 구체 조치와 규정의 보고·운전 조건을 함께 찾아야 한다. 본 연구의 범위는 오프라인 근거 확인·검토 지원이며, 운전 지시를 제공하거나 대체하지 않는다.</w:t>
+        <w:t>기관사와 관제원이 설비 고장 대응 절차를 확인하려면 현장 길라잡이의 구체적인 조치와 규정의 보고·운전 조건을 함께 찾아야 한다. 본 연구는 이러한 근거를 챗봇을 통해 확인하고 검토하는 과정을 지원하며, 운전 지시를 제공하거나 대체하지 않는다.</w:t>
       </w:r>
     </w:p>
     <w:p>
@@ -335,7 +339,7 @@
           <w:i w:val="0"/>
           <w:sz w:val="20"/>
         </w:rPr>
-        <w:t>검색 증강 생성은 외부 근거를 답변에 연결하고[1], LLM 재정렬은 검색 후보의 질의 관련 순서를 조정한다[2]. GraphRAG와 LightRAG는 문서에서 관계 그래프를 구성하며[3,4], KG²RAG는 검색 seed에서 연결 문단을 확장한다[5]. 철도 QA의 CARAG는 공간·사례 그래프를 탐색하고, 도시철도 출입문 RAG는 고장 이력과 재정렬을 이용한다[6,7]. LegalBench-RAG는 전문가 근거 주석을 제공하고, 한국어 법률 RAG는 검색 조합을 최적화한다[8,9]. 답변 지표는 RAGAS로 계산한다[10]. 본 연구는 새 그래프 검색 알고리즘의 우월성을 주장하지 않는다. 평가 단위는 추출한 일반 관계가 아니라 관리자가 연결한 규정–길라잡이 문서 구간이며, 승인 링크 상태와 근거 위치를 운영 경계로 사용한다.</w:t>
+        <w:t>검색 증강 생성은 외부 근거를 답변 생성에 활용하며[1], LLM 기반 재정렬은 검색 후보를 질의 관련성에 따라 정렬한다[2]. GraphRAG와 LightRAG는 문서에서 관계 그래프를 구성하고[3,4], KG²RAG는 초기 검색 결과에서 연결된 청크를 확장한다[5]. 철도 QA 분야에서 CARAG는 개념·인스턴스 계층의 공간 지식그래프를 탐색하며, 도시철도 출입문 RAG는 고장 이력과 재정렬을 활용한다[6,7]. LegalBench-RAG는 전문가가 주석한 근거를 제공하고, 한국어 법률 RAG 연구는 검색 기법의 조합을 최적화한다[8,9]. 본 연구는 새로운 그래프 검색 알고리즘의 우월성보다, 관리자가 연결한 규정과 길라잡이의 문서 구간을 활용하는 검색 확장의 효과를 평가한다.</w:t>
       </w:r>
     </w:p>
     <w:p>
@@ -367,7 +371,23 @@
           <w:i w:val="0"/>
           <w:sz w:val="20"/>
         </w:rPr>
-        <w:t>하이브리드 검색 상위 20개에서 LLM이 직접 근거를 최대 top_k=5개 고른 뒤, 직접 근거를 보존하고 승인 링크로 연결 구간을 확장한다. link_all은 전체 최종 근거를 최대 top_k×3개로 제한한다. proposed는 직접 근거를 모두 보존하고 연결 근거만 질문별 재정렬해 최대 top_k×2개 더한다. hybrid_rerank_k3는 선택 결과가 3개 미만이면 hybrid 순위에서 보충하는 예산 민감도 기준선이다. 이 opt-in 설정은 최대 top_k까지 최소 개수를 보장하며, 기본값은 기존 동작을 유지한다.</w:t>
+        <w:t>비교 방법은 BM25, Dense, Hybrid, H+RR (Hybrid 후보를 LLM이 재정렬하는 방식), K3, link_all, proposed의 7개로 구성한다. BM25는 어휘 일치 기반 검색, Dense는 임베딩 유사도 기반 검색이며, Hybrid는 두 검색 결과를 결합한다. 먼저 하이브리드 검색으로 후보 구간 20개를 찾고, LLM이 이 중 직접 근거를 최대 5개(top_k=5) 선택한다.</w:t>
+      </w:r>
+    </w:p>
+    <w:p>
+      <w:pPr>
+        <w:wordWrap/>
+        <w:spacing w:before="0" w:after="0" w:line="300" w:lineRule="exact"/>
+        <w:jc w:val="both"/>
+      </w:pPr>
+      <w:r>
+        <w:rPr>
+          <w:rFonts w:ascii="함초롬돋움" w:eastAsia="함초롬돋움" w:hAnsi="함초롬돋움" w:cs="함초롬돋움"/>
+          <w:b w:val="0"/>
+          <w:i w:val="0"/>
+          <w:sz w:val="20"/>
+        </w:rPr>
+        <w:t>link_all과 proposed는 H+RR이 선택한 직접 근거를 보존하면서 승인 링크로 연결된 문서 구간을 추가한다. link_all은 최종 근거 수를 최대 15개(top_k×3)로 제한한다. proposed는 연결 근거만 질문 관련성에 따라 재정렬·선별하여 최대 10개(top_k×2)를 추가한다. K3(hybrid_rerank_k3)는 선택된 근거가 3개 미만이면 Hybrid 순위에 따라 보충하는 비교 방식으로, 근거 수에 따른 성능 변화를 살펴보기 위해 사용한다.</w:t>
       </w:r>
     </w:p>
     <w:p>
@@ -380,7 +400,7 @@
         <w:drawing>
           <wp:inline xmlns:a="http://schemas.openxmlformats.org/drawingml/2006/main" xmlns:pic="http://schemas.openxmlformats.org/drawingml/2006/picture">
             <wp:extent cx="3024000" cy="2352000"/>
-            <wp:docPr id="1" name="Picture 1" descr="그림 1. 승인 링크 기반 검색 파이프라인"/>
+            <wp:docPr id="1" name="Picture 1" descr="그림 1. 승인 링크 기반 검색 과정"/>
             <wp:cNvGraphicFramePr>
               <a:graphicFrameLocks noChangeAspect="1"/>
             </wp:cNvGraphicFramePr>
@@ -424,7 +444,7 @@
           <w:i w:val="0"/>
           <w:sz w:val="18"/>
         </w:rPr>
-        <w:t>그림 1. 승인 링크 기반 검색 파이프라인 (직접 근거는 보존하고 링크 경유 근거만 선택)</w:t>
+        <w:t>그림 1. 승인 링크 기반 검색 과정. 직접 근거를 보존하고 연결 근거만 선별한다.</w:t>
       </w:r>
     </w:p>
     <w:p>
@@ -456,7 +476,23 @@
           <w:i w:val="0"/>
           <w:sz w:val="20"/>
         </w:rPr>
-        <w:t>평가셋 v3은 existing_v2 17건(문서형 12, 그래프형 5)과 llm_drafted 20건(문서형 5, 그래프형 15)으로 구성된다. llm_drafted 20건은 철도 운영기관 현업 전문가 1인이 질문 현실성, 정답 근거 정확성, 참조 답변 정확성, 링크 필요성을 다루는 체크리스트로 검토해 모두 OK 판정(수정·삭제 0건)을 받았다. 일곱 변형 모두 37건에서 검색을 세 번 실행했다. hybrid_rerank_k3는 r1만 답변·RAGAS 평가를 하고 r2–r3은 검색 평가만 했다. 따라서 검색 평균은 세 반복, 해당 변형의 답변 지표 및 matched 답변 비교는 r1 결과다. 생성·평가 judge는 gpt-5.6-luna, 검색·평가 임베딩은 각각 text-embedding-3-small, text-embedding-3-large였다. 평가 시점 승인 링크 스냅샷에는 36개 행이 있으며 스냅샷 해시는 재현용 기록에 보관했다.</w:t>
+        <w:t>평가셋은 기존 사례(existing_v2) 17건과 링크 기반 생성 사례(llm_drafted) 20건으로 구성된다. 기존 사례는 문서형 12건과 그래프형 5건, 생성 사례는 문서형 5건과 그래프형 15건이다. 생성 사례 20건은 철도 운영기관 현업 전문가 1인이 질문의 현실성, 정답 근거와 참조 답변의 정확성, 링크의 필요성을 체크리스트로 검토했다. 모두 적합 판정을 받았으며 수정·삭제된 사례는 없었다.</w:t>
+      </w:r>
+    </w:p>
+    <w:p>
+      <w:pPr>
+        <w:wordWrap/>
+        <w:spacing w:before="0" w:after="0" w:line="300" w:lineRule="exact"/>
+        <w:jc w:val="both"/>
+      </w:pPr>
+      <w:r>
+        <w:rPr>
+          <w:rFonts w:ascii="함초롬돋움" w:eastAsia="함초롬돋움" w:hAnsi="함초롬돋움" w:cs="함초롬돋움"/>
+          <w:b w:val="0"/>
+          <w:i w:val="0"/>
+          <w:sz w:val="20"/>
+        </w:rPr>
+        <w:t>2절의 7개 방법으로 평가 질문 37건을 각각 3회 검색했다. hybrid_rerank_k3의 답변 생성과 RAGAS 평가[10]는 첫 번째 실행(r1)에서만 수행하고, r2와 r3에서는 검색만 평가했다. 따라서 검색 지표는 3회 평균이며, 이 기준선의 답변 지표와 동일 실행 간 답변 비교는 r1 결과이다. 답변 생성 모델과 자동 평가 모델은 모두 gpt-5.6-luna이다. 검색용 임베딩은 text-embedding-3-small, 평가용 임베딩은 text-embedding-3-large를 사용했다. 평가 시점의 승인 링크 스냅샷은 36개 행으로 구성되며, 해시는 재현용 기록에 보관했다. 승인 링크로 연결된 문서 구간 중 정답 근거로 지정한 구간을 링크 정답 근거라 한다. 평가 데이터에서는 이를 via_link로 표시한다.</w:t>
       </w:r>
     </w:p>
     <w:p>
@@ -473,7 +509,7 @@
           <w:i w:val="0"/>
           <w:sz w:val="18"/>
         </w:rPr>
-        <w:t>표 1. 그래프 질의 검색 결과 (n=20, 세 반복 평균±표준편차). H+RR=hybrid_rerank, K3=hybrid_rerank_k3.</w:t>
+        <w:t>표 1. 그래프형 질의의 검색 결과(n=20). 3회 반복 평균±표준편차. H+RR=hybrid_rerank, K3=hybrid_rerank_k3.</w:t>
       </w:r>
     </w:p>
     <w:tbl>
@@ -1323,7 +1359,7 @@
           <w:i w:val="0"/>
           <w:sz w:val="18"/>
         </w:rPr>
-        <w:t>표 2. 출처별 paired 차이와 끝점 군집 bootstrap 95% CI (10,000회). L=link_all, P=proposed, K3=hybrid_rerank_k3.</w:t>
+        <w:t>표 2. 동일 질의에 대한 방법 간 차이와 끝점 군집 부트스트랩 95% 신뢰구간(10,000회). L=link_all, P=proposed, K3=hybrid_rerank_k3.</w:t>
       </w:r>
     </w:p>
     <w:tbl>
@@ -1447,7 +1483,7 @@
                 <w:i w:val="0"/>
                 <w:sz w:val="18"/>
               </w:rPr>
-              <w:t>existing_v2 (사례 5/군집 5)</w:t>
+              <w:t>기존 사례 (사례 5/군집 5)</w:t>
             </w:r>
           </w:p>
         </w:tc>
@@ -1768,7 +1804,7 @@
                 <w:i w:val="0"/>
                 <w:sz w:val="18"/>
               </w:rPr>
-              <w:t>llm_drafted (사례 15/군집 6)</w:t>
+              <w:t>링크 기반 생성 사례 (사례 15/군집 6)</w:t>
             </w:r>
           </w:p>
         </w:tc>
@@ -2087,7 +2123,7 @@
           <w:i w:val="0"/>
           <w:sz w:val="20"/>
         </w:rPr>
-        <w:t>군집은 같은 via_link 정답 끝점(문서 버전, 조항)을 공유하는 사례의 연결요소로 묶었으며, link ID가 없어 끝점 공유를 대리 지표로 썼다. 5개 개발·6개 신규 군집은 작아 CI는 확증적 추론이 아니다. 신규 그래프 15건은 승인 링크와 양 끝 원문에서 초안되어 해당 링크에 조건부인 표본이다.</w:t>
+        <w:t>동일한 정답 조항을 공유하는 사례 사이의 의존성을 고려해 군집 단위로 재표집했다. 같은 문서 버전과 조항을 via_link 정답 끝점으로 공유하는 사례들을 연결하고, 각 연결요소를 하나의 군집으로 정의했다. 링크 ID가 없어 끝점 공유 여부를 대리 지표로 사용했다. 기존 사례 5개 군집과 생성 사례 6개 군집은 규모가 작으므로 신뢰구간을 효과를 확정하는 근거로 사용하지 않는다. 생성 사례의 그래프형 질의 15건은 승인 링크와 양 끝의 원문에서 초안을 작성했으므로, 해당 링크를 전제로 구성된 표본이다.</w:t>
       </w:r>
     </w:p>
     <w:p>
@@ -2104,7 +2140,7 @@
           <w:i w:val="0"/>
           <w:sz w:val="18"/>
         </w:rPr>
-        <w:t>표 3. proposed − link_all의 출처별 문맥·답변·지연 차이 (끝점 군집 bootstrap 95% CI, 탐색적).</w:t>
+        <w:t>표 3. proposed와 link_all의 출처별 문맥·답변·지연 차이 (proposed − link_all). 끝점 군집 부트스트랩 95% 신뢰구간을 제시한 탐색적 분석.</w:t>
       </w:r>
     </w:p>
     <w:tbl>
@@ -2178,7 +2214,7 @@
                 <w:i w:val="0"/>
                 <w:sz w:val="18"/>
               </w:rPr>
-              <w:t>existing_v2</w:t>
+              <w:t>기존 사례</w:t>
             </w:r>
             <w:r>
               <w:br/>
@@ -2213,7 +2249,7 @@
                 <w:i w:val="0"/>
                 <w:sz w:val="18"/>
               </w:rPr>
-              <w:t>llm_drafted</w:t>
+              <w:t>링크 기반</w:t>
             </w:r>
             <w:r>
               <w:br/>
@@ -2225,7 +2261,7 @@
                 <w:i w:val="0"/>
                 <w:sz w:val="18"/>
               </w:rPr>
-              <w:t>(15/6)</w:t>
+              <w:t>생성 사례 (15/6)</w:t>
             </w:r>
           </w:p>
         </w:tc>
@@ -2580,7 +2616,23 @@
           <w:i w:val="0"/>
           <w:sz w:val="20"/>
         </w:rPr>
-        <w:t>proposed−k3의 matched r1 RAGAS Δ는 기존 사례에서 Context Precision −0.266 [−0.478, −0.099], Answer Correctness −0.022 [−0.120, +0.077], 신규 사례에서 각각 +0.020 [−0.047, +0.078], +0.031 [−0.043, +0.136]이다. k3 답변 지표와 두 matched 차이는 r1만 있어 기술적으로 해석한다. 그래프 질의 평균 지연은 k3/link_all/proposed 순으로 1.446/2.157/2.678초다. 답변 생성과 RAGAS 채점은 같은 모델이며 블라인드 사람 평가는 없었다. 비용은 일관되게 기록되지 않아 비교하지 않았다.</w:t>
+        <w:t>proposed와 K3의 답변 지표는 동일한 첫 번째 실행(r1)에서 비교했다. 기존 사례의 Context Precision 차이는 −0.266 [−0.478, −0.099], Answer Correctness 차이는 −0.022 [−0.120, +0.077]이다. 생성 사례에서는 각각 +0.020 [−0.047, +0.078], +0.031 [−0.043, +0.136]이다. K3의 답변 평가와 이에 대응하는 비교는 단일 실행의 기술통계로만 해석한다.</w:t>
+      </w:r>
+    </w:p>
+    <w:p>
+      <w:pPr>
+        <w:wordWrap/>
+        <w:spacing w:before="0" w:after="0" w:line="300" w:lineRule="exact"/>
+        <w:jc w:val="both"/>
+      </w:pPr>
+      <w:r>
+        <w:rPr>
+          <w:rFonts w:ascii="함초롬돋움" w:eastAsia="함초롬돋움" w:hAnsi="함초롬돋움" w:cs="함초롬돋움"/>
+          <w:b w:val="0"/>
+          <w:i w:val="0"/>
+          <w:sz w:val="20"/>
+        </w:rPr>
+        <w:t>그래프형 질의의 평균 지연은 K3, link_all, proposed 순으로 1.446초, 2.157초, 2.678초이다. 답변 생성과 자동 채점에는 같은 모델을 사용했으며, 블라인드 사람 평가는 수행하지 않았다. 비용은 일관되게 기록하지 않아 비교에서 제외했다.</w:t>
       </w:r>
     </w:p>
     <w:p>
@@ -2612,7 +2664,7 @@
           <w:i w:val="0"/>
           <w:sz w:val="20"/>
         </w:rPr>
-        <w:t>출처별 결과와 군집 구간은 개발 사례와 링크 구성 신규 사례를 나누어 해석해야 함을 보여준다. k3는 부족한 선택을 최소 3개까지 보충하지만 정확한 근거 수를 고정하지 않아, 이 비교는 예산 민감도 분석이지 토큰 예산 통제 실험은 아니다. 링크 구성에 유리한 표본을 배제하지 못하므로 현장 질의 전반에 일반화하지 않는다.</w:t>
+        <w:t>기존 사례와 링크 기반 생성 사례는 표본 구성 방식이 다르므로 출처별 결과와 신뢰구간을 나누어 해석해야 한다. K3는 선택된 근거가 부족할 때 최소 3개까지 보충하지만 근거 수를 고정하지 않는다. 따라서 이 비교는 예산 민감도 분석이며, 토큰 예산을 통제한 실험은 아니다. 평가 사례가 링크 활용에 유리한 질문에 치우쳤을 가능성이 있으므로, 본 결과만으로 실제 현장 질의 전반에서 동일한 효과를 기대하기는 어렵다.</w:t>
       </w:r>
     </w:p>
     <w:p>
@@ -2628,7 +2680,7 @@
           <w:i w:val="0"/>
           <w:sz w:val="20"/>
         </w:rPr>
-        <w:t>스냅샷은 평가 시점 상태만 보존하며 과거 상태는 복원하지 못한다. 관리자는 링크 양 끝 구간을 선택하고 승인 상태·담당자·시각을 기록하지만, 의미상 승인 기준과 문서 개정·폐기 규칙은 확인되지 않았다. 승인 상태를 독립 품질 검증으로 해석해서는 안 된다.</w:t>
+        <w:t>스냅샷은 평가 시점의 링크 상태만 보존하며 과거 상태를 복원하지 못한다. 관리자는 링크 양 끝의 구간을 선택하고 승인 상태, 담당자, 시각을 기록한다. 다만 의미적 적합성에 대한 승인 기준과 문서 개정·폐기 시 링크 처리 규칙은 확인되지 않았다. 따라서 승인 상태를 독립적인 품질 검증 결과로 해석해서는 안 된다.</w:t>
       </w:r>
     </w:p>
     <w:p>
@@ -2644,7 +2696,7 @@
           <w:i w:val="0"/>
           <w:sz w:val="20"/>
         </w:rPr>
-        <w:t>이 결과는 승인 링크 기반 확장이 이 평가 사례에서 교차문서 근거 회수를 돕는다는 탐색적 근거다. 두 출처는 나누어 보고하지만 llm_drafted 사례는 링크에서 구성되어 독립 holdout이 아니므로 설계상 순환성은 남는다. 단일 평가자 검수로 평가자 간 일치도를 산출하지 않았고, 검수자는 링크 구조에 대해 블라인드되지 않았다. 연결 근거가 빠져도 시스템은 경고 없이 직접 근거만으로 답할 수 있으므로, 사람 검수와 안전성 검증 전에는 실제 운전 판단에 사용해서는 안 된다.</w:t>
+        <w:t>승인 링크 확장은 평가 사례의 교차문서 근거 회수를 도왔다. 이는 탐색적 결과이며, 링크 기반 생성 사례는 독립 검증 표본이 아니다. 링크 구조를 아는 전문가 1인이 검수했으며 평가자 간 일치도는 산출하지 못했다. 연결 근거가 누락되어도 시스템은 경고 없이 직접 근거만으로 답할 수 있으므로, 사람의 검수와 안전성 검증 전에는 실제 운전 판단에 사용해서는 안 된다.</w:t>
       </w:r>
     </w:p>
     <w:p>

</xml_diff>